<commit_message>
Publish three-objective Thailand water-storage research dashboard
</commit_message>
<xml_diff>
--- a/downloads/AIT_Research_Report_Farzeen_Khanal.docx
+++ b/downloads/AIT_Research_Report_Farzeen_Khanal.docx
@@ -40,7 +40,7 @@
           <w:color w:val="000000"/>
           <w:sz w:val="24"/>
         </w:rPr>
-        <w:t>Farzeen Khanal</w:t>
+        <w:t>Farzeen Khan</w:t>
       </w:r>
     </w:p>
     <w:p>
@@ -141,7 +141,7 @@
         </w:numPr>
         <w:spacing w:after="480"/>
       </w:pPr>
-      <w:bookmarkStart w:id="0" w:name="_Toc243747293"/>
+      <w:bookmarkStart w:id="0" w:name="_Toc243756221"/>
       <w:r>
         <w:rPr>
           <w:color w:val="000000"/>
@@ -162,63 +162,7 @@
           <w:color w:val="000000"/>
           <w:sz w:val="24"/>
         </w:rPr>
-        <w:t>Thailand requires basin-scale evidence that distinguishes water-storage trends from the drivers of change. This study assessed terrestrial water storage anomalies (TWSA) and groundwater storage anomalies (GWSA) in 22 principal basins using the sup</w:t>
-      </w:r>
-      <w:r>
-        <w:rPr>
-          <w:rFonts w:ascii="Times New Roman" w:hAnsi="Times New Roman"/>
-          <w:color w:val="000000"/>
-          <w:sz w:val="24"/>
-        </w:rPr>
-        <w:t>plied GRACE/GRACE-FO record, a full-compartment groundwater balance, naturalized and historical-human WaterGAP simulations, and observed groundwater heads. Seasonal Sen slopes, Mann–Kendall tests, false-discovery-rate adjustment and calendar-year bootstrap</w:t>
-      </w:r>
-      <w:r>
-        <w:rPr>
-          <w:rFonts w:ascii="Times New Roman" w:hAnsi="Times New Roman"/>
-          <w:color w:val="000000"/>
-          <w:sz w:val="24"/>
-        </w:rPr>
-        <w:t xml:space="preserve"> intervals characterized trends. Climate emulators were trained on naturalized model storage rather than GRACE, using meteorological precipitation, potential evapotranspiration and antecedent memory. Training in 1991–2009, validation in 2010–2015 and testi</w:t>
-      </w:r>
-      <w:r>
-        <w:rPr>
-          <w:rFonts w:ascii="Times New Roman" w:hAnsi="Times New Roman"/>
-          <w:color w:val="000000"/>
-          <w:sz w:val="24"/>
-        </w:rPr>
-        <w:t>ng in 2016–2023 separated model development from evaluation. The original national records showed seasonal Sen slopes of −7.46 mm/year for TWSA through September 2024 and −6.82 mm/year for GWSA through September 2023. National emulator test NSE was 0.981 f</w:t>
-      </w:r>
-      <w:r>
-        <w:rPr>
-          <w:rFonts w:ascii="Times New Roman" w:hAnsi="Times New Roman"/>
-          <w:color w:val="000000"/>
-          <w:sz w:val="24"/>
-        </w:rPr>
-        <w:t>or TWSA and 0.961 for GWSA; deseasonalized NSE was 0.888 and 0.781. These scores verify reproduction of a hydrological model, not observed human depletion. Naturalized-model comparison with observed storage was weaker, especially for GWSA. Groundwater evid</w:t>
-      </w:r>
-      <w:r>
-        <w:rPr>
-          <w:rFonts w:ascii="Times New Roman" w:hAnsi="Times New Roman"/>
-          <w:color w:val="000000"/>
-          <w:sz w:val="24"/>
-        </w:rPr>
-        <w:t>ence comprised 5,484 aggregates from 511 wells, predominantly annual. Residual–head correlations were 0.142 for TWSA and 0.054 for GWSA, with similarly weak climate-controlled associations. A public decision-support application exposes all basin results an</w:t>
-      </w:r>
-      <w:r>
-        <w:rPr>
-          <w:rFonts w:ascii="Times New Roman" w:hAnsi="Times New Roman"/>
-          <w:color w:val="000000"/>
-          <w:sz w:val="24"/>
-        </w:rPr>
-        <w:t>d their limitations. The study establishes a reproducible climate-baseline framework but does not validate interpreting the entire unexplained residual as human-caused depletion. Coarse GRACE support, compartment filtering, sparse aquifer information and i</w:t>
-      </w:r>
-      <w:r>
-        <w:rPr>
-          <w:rFonts w:ascii="Times New Roman" w:hAnsi="Times New Roman"/>
-          <w:color w:val="000000"/>
-          <w:sz w:val="24"/>
-        </w:rPr>
-        <w:t>ncomplete original GRACE processing metadata constrain causal interpretation.</w:t>
+        <w:t>Thailand requires basin-scale evidence that distinguishes water-storage trends from the drivers of change. This study assessed terrestrial water storage anomalies (TWSA) and groundwater storage anomalies (GWSA) in 22 principal basins using the supplied GRACE/GRACE-FO record, a full-compartment groundwater balance, naturalized and historical-human WaterGAP simulations, and observed groundwater heads. Seasonal Sen slopes, Mann–Kendall tests, false-discovery-rate adjustment and calendar-year bootstrap intervals characterized trends. Climate emulators were trained on naturalized model storage rather than GRACE, using meteorological precipitation, potential evapotranspiration and antecedent memory. Training in 1991–2009, validation in 2010–2015 and testing in 2016–2023 separated model development from evaluation. The original national records showed seasonal Sen slopes of −7.46 mm/year for TWSA through September 2024 and −6.82 mm/year for GWSA through September 2023. National emulator test NSE was 0.981 for TWSA and 0.961 for GWSA; deseasonalized NSE was 0.888 and 0.781. These scores verify reproduction of a hydrological model, not observed human depletion. Naturalized-model comparison with observed storage was weaker, especially for GWSA. Groundwater evidence comprised 5,484 aggregates from 511 wells, predominantly annual. Residual–head correlations were 0.142 for TWSA and 0.054 for GWSA, with similarly weak climate-controlled associations. A public decision-support application exposes all basin results and their limitations. The study establishes a reproducible climate-baseline framework but does not validate interpreting the entire unexplained residual as human-caused depletion. Coarse GRACE support, compartment filtering, sparse aquifer information and incomplete original GRACE processing metadata constrain causal interpretation.</w:t>
       </w:r>
     </w:p>
     <w:p>
@@ -265,7 +209,7 @@
       <w:r>
         <w:fldChar w:fldCharType="separate"/>
       </w:r>
-      <w:hyperlink w:anchor="_Toc243747293" w:history="1">
+      <w:hyperlink w:anchor="_Toc243756221" w:history="1">
         <w:r>
           <w:rPr>
             <w:rStyle w:val="Hyperlink"/>
@@ -292,7 +236,7 @@
             <w:noProof/>
             <w:webHidden/>
           </w:rPr>
-          <w:instrText xml:space="preserve"> PAGEREF _Toc243747293 \h </w:instrText>
+          <w:instrText xml:space="preserve"> PAGEREF _Toc243756221 \h </w:instrText>
         </w:r>
         <w:r>
           <w:rPr>
@@ -337,7 +281,7 @@
           <w:lang w:bidi="ar-SA"/>
         </w:rPr>
       </w:pPr>
-      <w:hyperlink w:anchor="_Toc243747294" w:history="1">
+      <w:hyperlink w:anchor="_Toc243756222" w:history="1">
         <w:r>
           <w:rPr>
             <w:rStyle w:val="Hyperlink"/>
@@ -364,7 +308,7 @@
             <w:noProof/>
             <w:webHidden/>
           </w:rPr>
-          <w:instrText xml:space="preserve"> PAGEREF _Toc243747294 \h </w:instrText>
+          <w:instrText xml:space="preserve"> PAGEREF _Toc243756222 \h </w:instrText>
         </w:r>
         <w:r>
           <w:rPr>
@@ -409,7 +353,7 @@
           <w:lang w:bidi="ar-SA"/>
         </w:rPr>
       </w:pPr>
-      <w:hyperlink w:anchor="_Toc243747295" w:history="1">
+      <w:hyperlink w:anchor="_Toc243756223" w:history="1">
         <w:r>
           <w:rPr>
             <w:rStyle w:val="Hyperlink"/>
@@ -436,7 +380,7 @@
             <w:noProof/>
             <w:webHidden/>
           </w:rPr>
-          <w:instrText xml:space="preserve"> PAGEREF _Toc243747295 \h </w:instrText>
+          <w:instrText xml:space="preserve"> PAGEREF _Toc243756223 \h </w:instrText>
         </w:r>
         <w:r>
           <w:rPr>
@@ -481,7 +425,7 @@
           <w:lang w:bidi="ar-SA"/>
         </w:rPr>
       </w:pPr>
-      <w:hyperlink w:anchor="_Toc243747296" w:history="1">
+      <w:hyperlink w:anchor="_Toc243756224" w:history="1">
         <w:r>
           <w:rPr>
             <w:rStyle w:val="Hyperlink"/>
@@ -508,7 +452,7 @@
             <w:noProof/>
             <w:webHidden/>
           </w:rPr>
-          <w:instrText xml:space="preserve"> PAGEREF _Toc243747296 \h </w:instrText>
+          <w:instrText xml:space="preserve"> PAGEREF _Toc243756224 \h </w:instrText>
         </w:r>
         <w:r>
           <w:rPr>
@@ -553,7 +497,7 @@
           <w:lang w:bidi="ar-SA"/>
         </w:rPr>
       </w:pPr>
-      <w:hyperlink w:anchor="_Toc243747297" w:history="1">
+      <w:hyperlink w:anchor="_Toc243756225" w:history="1">
         <w:r>
           <w:rPr>
             <w:rStyle w:val="Hyperlink"/>
@@ -580,7 +524,7 @@
             <w:noProof/>
             <w:webHidden/>
           </w:rPr>
-          <w:instrText xml:space="preserve"> PAGEREF _Toc243747297 \h </w:instrText>
+          <w:instrText xml:space="preserve"> PAGEREF _Toc243756225 \h </w:instrText>
         </w:r>
         <w:r>
           <w:rPr>
@@ -623,7 +567,7 @@
           <w:lang w:bidi="ar-SA"/>
         </w:rPr>
       </w:pPr>
-      <w:hyperlink w:anchor="_Toc243747298" w:history="1">
+      <w:hyperlink w:anchor="_Toc243756226" w:history="1">
         <w:r>
           <w:rPr>
             <w:rStyle w:val="Hyperlink"/>
@@ -650,7 +594,7 @@
             <w:noProof/>
             <w:webHidden/>
           </w:rPr>
-          <w:instrText xml:space="preserve"> PAGEREF _Toc243747298 \h </w:instrText>
+          <w:instrText xml:space="preserve"> PAGEREF _Toc243756226 \h </w:instrText>
         </w:r>
         <w:r>
           <w:rPr>
@@ -693,7 +637,7 @@
           <w:lang w:bidi="ar-SA"/>
         </w:rPr>
       </w:pPr>
-      <w:hyperlink w:anchor="_Toc243747299" w:history="1">
+      <w:hyperlink w:anchor="_Toc243756227" w:history="1">
         <w:r>
           <w:rPr>
             <w:rStyle w:val="Hyperlink"/>
@@ -720,7 +664,7 @@
             <w:noProof/>
             <w:webHidden/>
           </w:rPr>
-          <w:instrText xml:space="preserve"> PAGEREF _Toc243747299 \h </w:instrText>
+          <w:instrText xml:space="preserve"> PAGEREF _Toc243756227 \h </w:instrText>
         </w:r>
         <w:r>
           <w:rPr>
@@ -763,7 +707,7 @@
           <w:lang w:bidi="ar-SA"/>
         </w:rPr>
       </w:pPr>
-      <w:hyperlink w:anchor="_Toc243747300" w:history="1">
+      <w:hyperlink w:anchor="_Toc243756228" w:history="1">
         <w:r>
           <w:rPr>
             <w:rStyle w:val="Hyperlink"/>
@@ -790,7 +734,7 @@
             <w:noProof/>
             <w:webHidden/>
           </w:rPr>
-          <w:instrText xml:space="preserve"> PAGEREF _Toc243747300 \h </w:instrText>
+          <w:instrText xml:space="preserve"> PAGEREF _Toc243756228 \h </w:instrText>
         </w:r>
         <w:r>
           <w:rPr>
@@ -833,7 +777,7 @@
           <w:lang w:bidi="ar-SA"/>
         </w:rPr>
       </w:pPr>
-      <w:hyperlink w:anchor="_Toc243747301" w:history="1">
+      <w:hyperlink w:anchor="_Toc243756229" w:history="1">
         <w:r>
           <w:rPr>
             <w:rStyle w:val="Hyperlink"/>
@@ -860,7 +804,7 @@
             <w:noProof/>
             <w:webHidden/>
           </w:rPr>
-          <w:instrText xml:space="preserve"> PAGEREF _Toc243747301 \h </w:instrText>
+          <w:instrText xml:space="preserve"> PAGEREF _Toc243756229 \h </w:instrText>
         </w:r>
         <w:r>
           <w:rPr>
@@ -905,7 +849,7 @@
           <w:lang w:bidi="ar-SA"/>
         </w:rPr>
       </w:pPr>
-      <w:hyperlink w:anchor="_Toc243747302" w:history="1">
+      <w:hyperlink w:anchor="_Toc243756230" w:history="1">
         <w:r>
           <w:rPr>
             <w:rStyle w:val="Hyperlink"/>
@@ -932,7 +876,7 @@
             <w:noProof/>
             <w:webHidden/>
           </w:rPr>
-          <w:instrText xml:space="preserve"> PAGEREF _Toc243747302 \h </w:instrText>
+          <w:instrText xml:space="preserve"> PAGEREF _Toc243756230 \h </w:instrText>
         </w:r>
         <w:r>
           <w:rPr>
@@ -975,7 +919,7 @@
           <w:lang w:bidi="ar-SA"/>
         </w:rPr>
       </w:pPr>
-      <w:hyperlink w:anchor="_Toc243747303" w:history="1">
+      <w:hyperlink w:anchor="_Toc243756231" w:history="1">
         <w:r>
           <w:rPr>
             <w:rStyle w:val="Hyperlink"/>
@@ -1002,7 +946,7 @@
             <w:noProof/>
             <w:webHidden/>
           </w:rPr>
-          <w:instrText xml:space="preserve"> PAGEREF _Toc243747303 \h </w:instrText>
+          <w:instrText xml:space="preserve"> PAGEREF _Toc243756231 \h </w:instrText>
         </w:r>
         <w:r>
           <w:rPr>
@@ -1045,7 +989,7 @@
           <w:lang w:bidi="ar-SA"/>
         </w:rPr>
       </w:pPr>
-      <w:hyperlink w:anchor="_Toc243747304" w:history="1">
+      <w:hyperlink w:anchor="_Toc243756232" w:history="1">
         <w:r>
           <w:rPr>
             <w:rStyle w:val="Hyperlink"/>
@@ -1072,7 +1016,7 @@
             <w:noProof/>
             <w:webHidden/>
           </w:rPr>
-          <w:instrText xml:space="preserve"> PAGEREF _Toc243747304 \h </w:instrText>
+          <w:instrText xml:space="preserve"> PAGEREF _Toc243756232 \h </w:instrText>
         </w:r>
         <w:r>
           <w:rPr>
@@ -1115,7 +1059,7 @@
           <w:lang w:bidi="ar-SA"/>
         </w:rPr>
       </w:pPr>
-      <w:hyperlink w:anchor="_Toc243747305" w:history="1">
+      <w:hyperlink w:anchor="_Toc243756233" w:history="1">
         <w:r>
           <w:rPr>
             <w:rStyle w:val="Hyperlink"/>
@@ -1142,7 +1086,7 @@
             <w:noProof/>
             <w:webHidden/>
           </w:rPr>
-          <w:instrText xml:space="preserve"> PAGEREF _Toc243747305 \h </w:instrText>
+          <w:instrText xml:space="preserve"> PAGEREF _Toc243756233 \h </w:instrText>
         </w:r>
         <w:r>
           <w:rPr>
@@ -1185,7 +1129,7 @@
           <w:lang w:bidi="ar-SA"/>
         </w:rPr>
       </w:pPr>
-      <w:hyperlink w:anchor="_Toc243747306" w:history="1">
+      <w:hyperlink w:anchor="_Toc243756234" w:history="1">
         <w:r>
           <w:rPr>
             <w:rStyle w:val="Hyperlink"/>
@@ -1212,7 +1156,7 @@
             <w:noProof/>
             <w:webHidden/>
           </w:rPr>
-          <w:instrText xml:space="preserve"> PAGEREF _Toc243747306 \h </w:instrText>
+          <w:instrText xml:space="preserve"> PAGEREF _Toc243756234 \h </w:instrText>
         </w:r>
         <w:r>
           <w:rPr>
@@ -1257,7 +1201,7 @@
           <w:lang w:bidi="ar-SA"/>
         </w:rPr>
       </w:pPr>
-      <w:hyperlink w:anchor="_Toc243747307" w:history="1">
+      <w:hyperlink w:anchor="_Toc243756235" w:history="1">
         <w:r>
           <w:rPr>
             <w:rStyle w:val="Hyperlink"/>
@@ -1284,7 +1228,7 @@
             <w:noProof/>
             <w:webHidden/>
           </w:rPr>
-          <w:instrText xml:space="preserve"> PAGEREF _Toc243747307 \h </w:instrText>
+          <w:instrText xml:space="preserve"> PAGEREF _Toc243756235 \h </w:instrText>
         </w:r>
         <w:r>
           <w:rPr>
@@ -1327,7 +1271,7 @@
           <w:lang w:bidi="ar-SA"/>
         </w:rPr>
       </w:pPr>
-      <w:hyperlink w:anchor="_Toc243747308" w:history="1">
+      <w:hyperlink w:anchor="_Toc243756236" w:history="1">
         <w:r>
           <w:rPr>
             <w:rStyle w:val="Hyperlink"/>
@@ -1354,7 +1298,7 @@
             <w:noProof/>
             <w:webHidden/>
           </w:rPr>
-          <w:instrText xml:space="preserve"> PAGEREF _Toc243747308 \h </w:instrText>
+          <w:instrText xml:space="preserve"> PAGEREF _Toc243756236 \h </w:instrText>
         </w:r>
         <w:r>
           <w:rPr>
@@ -1397,7 +1341,7 @@
           <w:lang w:bidi="ar-SA"/>
         </w:rPr>
       </w:pPr>
-      <w:hyperlink w:anchor="_Toc243747309" w:history="1">
+      <w:hyperlink w:anchor="_Toc243756237" w:history="1">
         <w:r>
           <w:rPr>
             <w:rStyle w:val="Hyperlink"/>
@@ -1424,7 +1368,7 @@
             <w:noProof/>
             <w:webHidden/>
           </w:rPr>
-          <w:instrText xml:space="preserve"> PAGEREF _Toc243747309 \h </w:instrText>
+          <w:instrText xml:space="preserve"> PAGEREF _Toc243756237 \h </w:instrText>
         </w:r>
         <w:r>
           <w:rPr>
@@ -1467,7 +1411,7 @@
           <w:lang w:bidi="ar-SA"/>
         </w:rPr>
       </w:pPr>
-      <w:hyperlink w:anchor="_Toc243747310" w:history="1">
+      <w:hyperlink w:anchor="_Toc243756238" w:history="1">
         <w:r>
           <w:rPr>
             <w:rStyle w:val="Hyperlink"/>
@@ -1494,7 +1438,7 @@
             <w:noProof/>
             <w:webHidden/>
           </w:rPr>
-          <w:instrText xml:space="preserve"> PAGEREF _Toc243747310 \h </w:instrText>
+          <w:instrText xml:space="preserve"> PAGEREF _Toc243756238 \h </w:instrText>
         </w:r>
         <w:r>
           <w:rPr>
@@ -1537,7 +1481,7 @@
           <w:lang w:bidi="ar-SA"/>
         </w:rPr>
       </w:pPr>
-      <w:hyperlink w:anchor="_Toc243747311" w:history="1">
+      <w:hyperlink w:anchor="_Toc243756239" w:history="1">
         <w:r>
           <w:rPr>
             <w:rStyle w:val="Hyperlink"/>
@@ -1564,7 +1508,7 @@
             <w:noProof/>
             <w:webHidden/>
           </w:rPr>
-          <w:instrText xml:space="preserve"> PAGEREF _Toc243747311 \h </w:instrText>
+          <w:instrText xml:space="preserve"> PAGEREF _Toc243756239 \h </w:instrText>
         </w:r>
         <w:r>
           <w:rPr>
@@ -1607,7 +1551,7 @@
           <w:lang w:bidi="ar-SA"/>
         </w:rPr>
       </w:pPr>
-      <w:hyperlink w:anchor="_Toc243747312" w:history="1">
+      <w:hyperlink w:anchor="_Toc243756240" w:history="1">
         <w:r>
           <w:rPr>
             <w:rStyle w:val="Hyperlink"/>
@@ -1634,7 +1578,7 @@
             <w:noProof/>
             <w:webHidden/>
           </w:rPr>
-          <w:instrText xml:space="preserve"> PAGEREF _Toc243747312 \h </w:instrText>
+          <w:instrText xml:space="preserve"> PAGEREF _Toc243756240 \h </w:instrText>
         </w:r>
         <w:r>
           <w:rPr>
@@ -1677,7 +1621,7 @@
           <w:lang w:bidi="ar-SA"/>
         </w:rPr>
       </w:pPr>
-      <w:hyperlink w:anchor="_Toc243747313" w:history="1">
+      <w:hyperlink w:anchor="_Toc243756241" w:history="1">
         <w:r>
           <w:rPr>
             <w:rStyle w:val="Hyperlink"/>
@@ -1704,7 +1648,7 @@
             <w:noProof/>
             <w:webHidden/>
           </w:rPr>
-          <w:instrText xml:space="preserve"> PAGEREF _Toc243747313 \h </w:instrText>
+          <w:instrText xml:space="preserve"> PAGEREF _Toc243756241 \h </w:instrText>
         </w:r>
         <w:r>
           <w:rPr>
@@ -1747,7 +1691,7 @@
           <w:lang w:bidi="ar-SA"/>
         </w:rPr>
       </w:pPr>
-      <w:hyperlink w:anchor="_Toc243747314" w:history="1">
+      <w:hyperlink w:anchor="_Toc243756242" w:history="1">
         <w:r>
           <w:rPr>
             <w:rStyle w:val="Hyperlink"/>
@@ -1774,7 +1718,7 @@
             <w:noProof/>
             <w:webHidden/>
           </w:rPr>
-          <w:instrText xml:space="preserve"> PAGEREF _Toc243747314 \h </w:instrText>
+          <w:instrText xml:space="preserve"> PAGEREF _Toc243756242 \h </w:instrText>
         </w:r>
         <w:r>
           <w:rPr>
@@ -1819,7 +1763,7 @@
           <w:lang w:bidi="ar-SA"/>
         </w:rPr>
       </w:pPr>
-      <w:hyperlink w:anchor="_Toc243747315" w:history="1">
+      <w:hyperlink w:anchor="_Toc243756243" w:history="1">
         <w:r>
           <w:rPr>
             <w:rStyle w:val="Hyperlink"/>
@@ -1846,7 +1790,7 @@
             <w:noProof/>
             <w:webHidden/>
           </w:rPr>
-          <w:instrText xml:space="preserve"> PAGEREF _Toc243747315 \h </w:instrText>
+          <w:instrText xml:space="preserve"> PAGEREF _Toc243756243 \h </w:instrText>
         </w:r>
         <w:r>
           <w:rPr>
@@ -1889,7 +1833,7 @@
           <w:lang w:bidi="ar-SA"/>
         </w:rPr>
       </w:pPr>
-      <w:hyperlink w:anchor="_Toc243747316" w:history="1">
+      <w:hyperlink w:anchor="_Toc243756244" w:history="1">
         <w:r>
           <w:rPr>
             <w:rStyle w:val="Hyperlink"/>
@@ -1916,7 +1860,7 @@
             <w:noProof/>
             <w:webHidden/>
           </w:rPr>
-          <w:instrText xml:space="preserve"> PAGEREF _Toc243747316 \h </w:instrText>
+          <w:instrText xml:space="preserve"> PAGEREF _Toc243756244 \h </w:instrText>
         </w:r>
         <w:r>
           <w:rPr>
@@ -1959,7 +1903,7 @@
           <w:lang w:bidi="ar-SA"/>
         </w:rPr>
       </w:pPr>
-      <w:hyperlink w:anchor="_Toc243747317" w:history="1">
+      <w:hyperlink w:anchor="_Toc243756245" w:history="1">
         <w:r>
           <w:rPr>
             <w:rStyle w:val="Hyperlink"/>
@@ -1986,7 +1930,7 @@
             <w:noProof/>
             <w:webHidden/>
           </w:rPr>
-          <w:instrText xml:space="preserve"> PAGEREF _Toc243747317 \h </w:instrText>
+          <w:instrText xml:space="preserve"> PAGEREF _Toc243756245 \h </w:instrText>
         </w:r>
         <w:r>
           <w:rPr>
@@ -2029,7 +1973,7 @@
           <w:lang w:bidi="ar-SA"/>
         </w:rPr>
       </w:pPr>
-      <w:hyperlink w:anchor="_Toc243747318" w:history="1">
+      <w:hyperlink w:anchor="_Toc243756246" w:history="1">
         <w:r>
           <w:rPr>
             <w:rStyle w:val="Hyperlink"/>
@@ -2056,7 +2000,7 @@
             <w:noProof/>
             <w:webHidden/>
           </w:rPr>
-          <w:instrText xml:space="preserve"> PAGEREF _Toc243747318 \h </w:instrText>
+          <w:instrText xml:space="preserve"> PAGEREF _Toc243756246 \h </w:instrText>
         </w:r>
         <w:r>
           <w:rPr>
@@ -2099,7 +2043,7 @@
           <w:lang w:bidi="ar-SA"/>
         </w:rPr>
       </w:pPr>
-      <w:hyperlink w:anchor="_Toc243747319" w:history="1">
+      <w:hyperlink w:anchor="_Toc243756247" w:history="1">
         <w:r>
           <w:rPr>
             <w:rStyle w:val="Hyperlink"/>
@@ -2126,7 +2070,7 @@
             <w:noProof/>
             <w:webHidden/>
           </w:rPr>
-          <w:instrText xml:space="preserve"> PAGEREF _Toc243747319 \h </w:instrText>
+          <w:instrText xml:space="preserve"> PAGEREF _Toc243756247 \h </w:instrText>
         </w:r>
         <w:r>
           <w:rPr>
@@ -2169,7 +2113,7 @@
           <w:lang w:bidi="ar-SA"/>
         </w:rPr>
       </w:pPr>
-      <w:hyperlink w:anchor="_Toc243747320" w:history="1">
+      <w:hyperlink w:anchor="_Toc243756248" w:history="1">
         <w:r>
           <w:rPr>
             <w:rStyle w:val="Hyperlink"/>
@@ -2196,7 +2140,7 @@
             <w:noProof/>
             <w:webHidden/>
           </w:rPr>
-          <w:instrText xml:space="preserve"> PAGEREF _Toc243747320 \h </w:instrText>
+          <w:instrText xml:space="preserve"> PAGEREF _Toc243756248 \h </w:instrText>
         </w:r>
         <w:r>
           <w:rPr>
@@ -2239,7 +2183,7 @@
           <w:lang w:bidi="ar-SA"/>
         </w:rPr>
       </w:pPr>
-      <w:hyperlink w:anchor="_Toc243747321" w:history="1">
+      <w:hyperlink w:anchor="_Toc243756249" w:history="1">
         <w:r>
           <w:rPr>
             <w:rStyle w:val="Hyperlink"/>
@@ -2266,7 +2210,7 @@
             <w:noProof/>
             <w:webHidden/>
           </w:rPr>
-          <w:instrText xml:space="preserve"> PAGEREF _Toc243747321 \h </w:instrText>
+          <w:instrText xml:space="preserve"> PAGEREF _Toc243756249 \h </w:instrText>
         </w:r>
         <w:r>
           <w:rPr>
@@ -2309,7 +2253,7 @@
           <w:lang w:bidi="ar-SA"/>
         </w:rPr>
       </w:pPr>
-      <w:hyperlink w:anchor="_Toc243747322" w:history="1">
+      <w:hyperlink w:anchor="_Toc243756250" w:history="1">
         <w:r>
           <w:rPr>
             <w:rStyle w:val="Hyperlink"/>
@@ -2336,7 +2280,7 @@
             <w:noProof/>
             <w:webHidden/>
           </w:rPr>
-          <w:instrText xml:space="preserve"> PAGEREF _Toc243747322 \h </w:instrText>
+          <w:instrText xml:space="preserve"> PAGEREF _Toc243756250 \h </w:instrText>
         </w:r>
         <w:r>
           <w:rPr>
@@ -2379,7 +2323,7 @@
           <w:lang w:bidi="ar-SA"/>
         </w:rPr>
       </w:pPr>
-      <w:hyperlink w:anchor="_Toc243747323" w:history="1">
+      <w:hyperlink w:anchor="_Toc243756251" w:history="1">
         <w:r>
           <w:rPr>
             <w:rStyle w:val="Hyperlink"/>
@@ -2406,7 +2350,7 @@
             <w:noProof/>
             <w:webHidden/>
           </w:rPr>
-          <w:instrText xml:space="preserve"> PAGEREF _Toc243747323 \h </w:instrText>
+          <w:instrText xml:space="preserve"> PAGEREF _Toc243756251 \h </w:instrText>
         </w:r>
         <w:r>
           <w:rPr>
@@ -2451,7 +2395,7 @@
           <w:lang w:bidi="ar-SA"/>
         </w:rPr>
       </w:pPr>
-      <w:hyperlink w:anchor="_Toc243747324" w:history="1">
+      <w:hyperlink w:anchor="_Toc243756252" w:history="1">
         <w:r>
           <w:rPr>
             <w:rStyle w:val="Hyperlink"/>
@@ -2478,7 +2422,7 @@
             <w:noProof/>
             <w:webHidden/>
           </w:rPr>
-          <w:instrText xml:space="preserve"> PAGEREF _Toc243747324 \h </w:instrText>
+          <w:instrText xml:space="preserve"> PAGEREF _Toc243756252 \h </w:instrText>
         </w:r>
         <w:r>
           <w:rPr>
@@ -2521,7 +2465,7 @@
           <w:lang w:bidi="ar-SA"/>
         </w:rPr>
       </w:pPr>
-      <w:hyperlink w:anchor="_Toc243747325" w:history="1">
+      <w:hyperlink w:anchor="_Toc243756253" w:history="1">
         <w:r>
           <w:rPr>
             <w:rStyle w:val="Hyperlink"/>
@@ -2548,7 +2492,7 @@
             <w:noProof/>
             <w:webHidden/>
           </w:rPr>
-          <w:instrText xml:space="preserve"> PAGEREF _Toc243747325 \h </w:instrText>
+          <w:instrText xml:space="preserve"> PAGEREF _Toc243756253 \h </w:instrText>
         </w:r>
         <w:r>
           <w:rPr>
@@ -2591,7 +2535,7 @@
           <w:lang w:bidi="ar-SA"/>
         </w:rPr>
       </w:pPr>
-      <w:hyperlink w:anchor="_Toc243747326" w:history="1">
+      <w:hyperlink w:anchor="_Toc243756254" w:history="1">
         <w:r>
           <w:rPr>
             <w:rStyle w:val="Hyperlink"/>
@@ -2618,7 +2562,7 @@
             <w:noProof/>
             <w:webHidden/>
           </w:rPr>
-          <w:instrText xml:space="preserve"> PAGEREF _Toc243747326 \h </w:instrText>
+          <w:instrText xml:space="preserve"> PAGEREF _Toc243756254 \h </w:instrText>
         </w:r>
         <w:r>
           <w:rPr>
@@ -2663,7 +2607,7 @@
           <w:lang w:bidi="ar-SA"/>
         </w:rPr>
       </w:pPr>
-      <w:hyperlink w:anchor="_Toc243747327" w:history="1">
+      <w:hyperlink w:anchor="_Toc243756255" w:history="1">
         <w:r>
           <w:rPr>
             <w:rStyle w:val="Hyperlink"/>
@@ -2690,7 +2634,7 @@
             <w:noProof/>
             <w:webHidden/>
           </w:rPr>
-          <w:instrText xml:space="preserve"> PAGEREF _Toc243747327 \h </w:instrText>
+          <w:instrText xml:space="preserve"> PAGEREF _Toc243756255 \h </w:instrText>
         </w:r>
         <w:r>
           <w:rPr>
@@ -2735,7 +2679,7 @@
           <w:lang w:bidi="ar-SA"/>
         </w:rPr>
       </w:pPr>
-      <w:hyperlink w:anchor="_Toc243747328" w:history="1">
+      <w:hyperlink w:anchor="_Toc243756256" w:history="1">
         <w:r>
           <w:rPr>
             <w:rStyle w:val="Hyperlink"/>
@@ -2762,7 +2706,7 @@
             <w:noProof/>
             <w:webHidden/>
           </w:rPr>
-          <w:instrText xml:space="preserve"> PAGEREF _Toc243747328 \h </w:instrText>
+          <w:instrText xml:space="preserve"> PAGEREF _Toc243756256 \h </w:instrText>
         </w:r>
         <w:r>
           <w:rPr>
@@ -2807,7 +2751,7 @@
           <w:lang w:bidi="ar-SA"/>
         </w:rPr>
       </w:pPr>
-      <w:hyperlink w:anchor="_Toc243747329" w:history="1">
+      <w:hyperlink w:anchor="_Toc243756257" w:history="1">
         <w:r>
           <w:rPr>
             <w:rStyle w:val="Hyperlink"/>
@@ -2834,7 +2778,7 @@
             <w:noProof/>
             <w:webHidden/>
           </w:rPr>
-          <w:instrText xml:space="preserve"> PAGEREF _Toc243747329 \h </w:instrText>
+          <w:instrText xml:space="preserve"> PAGEREF _Toc243756257 \h </w:instrText>
         </w:r>
         <w:r>
           <w:rPr>
@@ -2888,7 +2832,7 @@
         </w:numPr>
         <w:spacing w:after="480"/>
       </w:pPr>
-      <w:bookmarkStart w:id="1" w:name="_Toc243747294"/>
+      <w:bookmarkStart w:id="1" w:name="_Toc243756222"/>
       <w:r>
         <w:rPr>
           <w:color w:val="000000"/>
@@ -3121,15 +3065,7 @@
           <w:color w:val="000000"/>
           <w:sz w:val="24"/>
         </w:rPr>
-        <w:t xml:space="preserve">Table A.2 All </w:t>
-      </w:r>
-      <w:r>
-        <w:rPr>
-          <w:rFonts w:ascii="Times New Roman" w:hAnsi="Times New Roman"/>
-          <w:color w:val="000000"/>
-          <w:sz w:val="24"/>
-        </w:rPr>
-        <w:t>basin climate emulator verification</w:t>
+        <w:t>Table A.2 All basin climate emulator verification</w:t>
       </w:r>
       <w:r>
         <w:rPr>
@@ -3167,7 +3103,7 @@
         </w:numPr>
         <w:spacing w:after="480"/>
       </w:pPr>
-      <w:bookmarkStart w:id="2" w:name="_Toc243747295"/>
+      <w:bookmarkStart w:id="2" w:name="_Toc243756223"/>
       <w:r>
         <w:rPr>
           <w:color w:val="000000"/>
@@ -3400,7 +3336,7 @@
         </w:numPr>
         <w:spacing w:after="480"/>
       </w:pPr>
-      <w:bookmarkStart w:id="3" w:name="_Toc243747296"/>
+      <w:bookmarkStart w:id="3" w:name="_Toc243756224"/>
       <w:r>
         <w:rPr>
           <w:color w:val="000000"/>
@@ -3472,15 +3408,7 @@
           <w:color w:val="000000"/>
           <w:sz w:val="24"/>
         </w:rPr>
-        <w:t>G3P Global Gravity based Groun</w:t>
-      </w:r>
-      <w:r>
-        <w:rPr>
-          <w:rFonts w:ascii="Times New Roman" w:hAnsi="Times New Roman"/>
-          <w:color w:val="000000"/>
-          <w:sz w:val="24"/>
-        </w:rPr>
-        <w:t>dwater Product</w:t>
+        <w:t>G3P Global Gravity based Groundwater Product</w:t>
       </w:r>
     </w:p>
     <w:p>
@@ -3572,7 +3500,7 @@
         </w:numPr>
         <w:spacing w:after="480"/>
       </w:pPr>
-      <w:bookmarkStart w:id="4" w:name="_Toc243747297"/>
+      <w:bookmarkStart w:id="4" w:name="_Toc243756225"/>
       <w:r>
         <w:rPr>
           <w:color w:val="000000"/>
@@ -3598,7 +3526,7 @@
         </w:numPr>
         <w:spacing w:after="160"/>
       </w:pPr>
-      <w:bookmarkStart w:id="5" w:name="_Toc243747298"/>
+      <w:bookmarkStart w:id="5" w:name="_Toc243756226"/>
       <w:r>
         <w:rPr>
           <w:color w:val="000000"/>
@@ -3618,23 +3546,7 @@
           <w:color w:val="000000"/>
           <w:sz w:val="24"/>
         </w:rPr>
-        <w:t>Water-storage change integrates processes that rainfall or streamflow alone cannot describe. Soil water, surface water, canopy water, snow and groundwater contribute to terrestria</w:t>
-      </w:r>
-      <w:r>
-        <w:rPr>
-          <w:rFonts w:ascii="Times New Roman" w:hAnsi="Times New Roman"/>
-          <w:color w:val="000000"/>
-          <w:sz w:val="24"/>
-        </w:rPr>
-        <w:t>l storage, but each responds differently to climate and management. In a monsoonal setting, a model may achieve a high correlation simply by following the wet and dry seasons. Basin planning therefore requires tests of interannual variability as well as tr</w:t>
-      </w:r>
-      <w:r>
-        <w:rPr>
-          <w:rFonts w:ascii="Times New Roman" w:hAnsi="Times New Roman"/>
-          <w:color w:val="000000"/>
-          <w:sz w:val="24"/>
-        </w:rPr>
-        <w:t>ansparent treatment of the seasonal cycle.</w:t>
+        <w:t>Water-storage change integrates processes that rainfall or streamflow alone cannot describe. Soil water, surface water, canopy water, snow and groundwater contribute to terrestrial storage, but each responds differently to climate and management. In a monsoonal setting, a model may achieve a high correlation simply by following the wet and dry seasons. Basin planning therefore requires tests of interannual variability as well as transparent treatment of the seasonal cycle.</w:t>
       </w:r>
     </w:p>
     <w:p>
@@ -3648,15 +3560,7 @@
           <w:color w:val="000000"/>
           <w:sz w:val="24"/>
         </w:rPr>
-        <w:t>Thailand's principal basins provide an operational framework for comparing water availability and evidence gaps. Satellite gravimetry adds broad spatial coverage, while wells supply local observations of aquifer r</w:t>
-      </w:r>
-      <w:r>
-        <w:rPr>
-          <w:rFonts w:ascii="Times New Roman" w:hAnsi="Times New Roman"/>
-          <w:color w:val="000000"/>
-          <w:sz w:val="24"/>
-        </w:rPr>
-        <w:t>esponse. These measurements have different physical meanings and effective spatial scales. Their joint use is informative only when differences in units, sampling frequency, aquifer support and storage compartments are kept explicit.</w:t>
+        <w:t>Thailand's principal basins provide an operational framework for comparing water availability and evidence gaps. Satellite gravimetry adds broad spatial coverage, while wells supply local observations of aquifer response. These measurements have different physical meanings and effective spatial scales. Their joint use is informative only when differences in units, sampling frequency, aquifer support and storage compartments are kept explicit.</w:t>
       </w:r>
     </w:p>
     <w:p>
@@ -3668,7 +3572,7 @@
         </w:numPr>
         <w:spacing w:after="160"/>
       </w:pPr>
-      <w:bookmarkStart w:id="6" w:name="_Toc243747299"/>
+      <w:bookmarkStart w:id="6" w:name="_Toc243756227"/>
       <w:r>
         <w:rPr>
           <w:color w:val="000000"/>
@@ -3688,15 +3592,7 @@
           <w:color w:val="000000"/>
           <w:sz w:val="24"/>
         </w:rPr>
-        <w:t>A regression trained directly against GRACE learns the combined effects present in observed storage. If irrigation, abstraction or reservoir operations already affect the training target, the fitted relationship cannot automatically represent a world witho</w:t>
-      </w:r>
-      <w:r>
-        <w:rPr>
-          <w:rFonts w:ascii="Times New Roman" w:hAnsi="Times New Roman"/>
-          <w:color w:val="000000"/>
-          <w:sz w:val="24"/>
-        </w:rPr>
-        <w:t>ut those activities. Actual evapotranspiration, soil moisture and land-surface temperature can also respond to management. Calling the prediction purely climatic and the residual purely human would therefore exceed what that design identifies.</w:t>
+        <w:t>A regression trained directly against GRACE learns the combined effects present in observed storage. If irrigation, abstraction or reservoir operations already affect the training target, the fitted relationship cannot automatically represent a world without those activities. Actual evapotranspiration, soil moisture and land-surface temperature can also respond to management. Calling the prediction purely climatic and the residual purely human would therefore exceed what that design identifies.</w:t>
       </w:r>
     </w:p>
     <w:p>
@@ -3710,23 +3606,7 @@
           <w:color w:val="000000"/>
           <w:sz w:val="24"/>
         </w:rPr>
-        <w:t>A second pro</w:t>
-      </w:r>
-      <w:r>
-        <w:rPr>
-          <w:rFonts w:ascii="Times New Roman" w:hAnsi="Times New Roman"/>
-          <w:color w:val="000000"/>
-          <w:sz w:val="24"/>
-        </w:rPr>
-        <w:t>blem concerns validation. A well records hydraulic head at a point, whereas TWSA represents the integrated mass of several water compartments over a broad region. Even a groundwater head series contains both natural recharge effects and human effects. Agre</w:t>
-      </w:r>
-      <w:r>
-        <w:rPr>
-          <w:rFonts w:ascii="Times New Roman" w:hAnsi="Times New Roman"/>
-          <w:color w:val="000000"/>
-          <w:sz w:val="24"/>
-        </w:rPr>
-        <w:t>ement between a total-storage residual and well levels is consequently supporting groundwater evidence, not a direct measurement of human TWSA.</w:t>
+        <w:t>A second problem concerns validation. A well records hydraulic head at a point, whereas TWSA represents the integrated mass of several water compartments over a broad region. Even a groundwater head series contains both natural recharge effects and human effects. Agreement between a total-storage residual and well levels is consequently supporting groundwater evidence, not a direct measurement of human TWSA.</w:t>
       </w:r>
     </w:p>
     <w:p>
@@ -3738,7 +3618,7 @@
         </w:numPr>
         <w:spacing w:after="160"/>
       </w:pPr>
-      <w:bookmarkStart w:id="7" w:name="_Toc243747300"/>
+      <w:bookmarkStart w:id="7" w:name="_Toc243756228"/>
       <w:r>
         <w:rPr>
           <w:color w:val="000000"/>
@@ -3758,7 +3638,7 @@
           <w:color w:val="000000"/>
           <w:sz w:val="24"/>
         </w:rPr>
-        <w:t>The first objective was to characterize temporal and spatial TWSA and GWSA trends for ev</w:t>
+        <w:t xml:space="preserve">The first objective was to characterize temporal and spatial TWSA and GWSA trends for every principal basin, retaining uncertainty, missing observations and statistical limitations. The </w:t>
       </w:r>
       <w:r>
         <w:rPr>
@@ -3766,32 +3646,8 @@
           <w:color w:val="000000"/>
           <w:sz w:val="24"/>
         </w:rPr>
-        <w:t xml:space="preserve">ery principal basin, retaining uncertainty, missing observations and statistical limitations. The </w:t>
-      </w:r>
-      <w:r>
-        <w:rPr>
-          <w:rFonts w:ascii="Times New Roman" w:hAnsi="Times New Roman"/>
-          <w:color w:val="000000"/>
-          <w:sz w:val="24"/>
-        </w:rPr>
         <w:lastRenderedPageBreak/>
-        <w:t xml:space="preserve">second objective was to develop and evaluate climate-storage emulators against a documented naturalized hydrological baseline, then assess observed residuals </w:t>
-      </w:r>
-      <w:r>
-        <w:rPr>
-          <w:rFonts w:ascii="Times New Roman" w:hAnsi="Times New Roman"/>
-          <w:color w:val="000000"/>
-          <w:sz w:val="24"/>
-        </w:rPr>
-        <w:t>alongside paired modeled human effects and groundwater evidence. The third objective was to provide an interactive decision-support system with basin comparison, time-series exploration and downloadable results. Together these objectives connect observatio</w:t>
-      </w:r>
-      <w:r>
-        <w:rPr>
-          <w:rFonts w:ascii="Times New Roman" w:hAnsi="Times New Roman"/>
-          <w:color w:val="000000"/>
-          <w:sz w:val="24"/>
-        </w:rPr>
-        <w:t>n, model evaluation and evidence-based interpretation without requiring every basin to demonstrate anthropogenic depletion.</w:t>
+        <w:t>second objective was to develop and evaluate climate-storage emulators against a documented naturalized hydrological baseline, then assess observed residuals alongside paired modeled human effects and groundwater evidence. The third objective was to provide an interactive decision-support system with basin comparison, time-series exploration and downloadable results. Together these objectives connect observation, model evaluation and evidence-based interpretation without requiring every basin to demonstrate anthropogenic depletion.</w:t>
       </w:r>
     </w:p>
     <w:p>
@@ -3803,7 +3659,7 @@
         </w:numPr>
         <w:spacing w:after="160"/>
       </w:pPr>
-      <w:bookmarkStart w:id="8" w:name="_Toc243747301"/>
+      <w:bookmarkStart w:id="8" w:name="_Toc243756229"/>
       <w:r>
         <w:rPr>
           <w:color w:val="000000"/>
@@ -3823,23 +3679,7 @@
           <w:color w:val="000000"/>
           <w:sz w:val="24"/>
         </w:rPr>
-        <w:t>The supplied TWSA record spans April 2002 to September 2024; the full-compartment GWSA record ends Septem</w:t>
-      </w:r>
-      <w:r>
-        <w:rPr>
-          <w:rFonts w:ascii="Times New Roman" w:hAnsi="Times New Roman"/>
-          <w:color w:val="000000"/>
-          <w:sz w:val="24"/>
-        </w:rPr>
-        <w:t xml:space="preserve">ber 2023 because the surface-water correction ends then. WaterGAP simulations were extracted for 1981–2023, providing a longer climate-model development period and a common observed-attribution period where records overlap. The national aggregate supplies </w:t>
-      </w:r>
-      <w:r>
-        <w:rPr>
-          <w:rFonts w:ascii="Times New Roman" w:hAnsi="Times New Roman"/>
-          <w:color w:val="000000"/>
-          <w:sz w:val="24"/>
-        </w:rPr>
-        <w:t>context and is not a twenty-third independent basin. Results describe anomalies relative to 2004–2009 rather than total historical water loss before the satellite record.</w:t>
+        <w:t>The supplied TWSA record spans April 2002 to September 2024; the full-compartment GWSA record ends September 2023 because the surface-water correction ends then. WaterGAP simulations were extracted for 1981–2023, providing a longer climate-model development period and a common observed-attribution period where records overlap. The national aggregate supplies context and is not a twenty-third independent basin. Results describe anomalies relative to 2004–2009 rather than total historical water loss before the satellite record.</w:t>
       </w:r>
     </w:p>
     <w:p>
@@ -3856,7 +3696,7 @@
         </w:numPr>
         <w:spacing w:after="480"/>
       </w:pPr>
-      <w:bookmarkStart w:id="9" w:name="_Toc243747302"/>
+      <w:bookmarkStart w:id="9" w:name="_Toc243756230"/>
       <w:r>
         <w:rPr>
           <w:color w:val="000000"/>
@@ -3882,7 +3722,7 @@
         </w:numPr>
         <w:spacing w:after="160"/>
       </w:pPr>
-      <w:bookmarkStart w:id="10" w:name="_Toc243747303"/>
+      <w:bookmarkStart w:id="10" w:name="_Toc243756231"/>
       <w:r>
         <w:rPr>
           <w:color w:val="000000"/>
@@ -3902,15 +3742,7 @@
           <w:color w:val="000000"/>
           <w:sz w:val="24"/>
         </w:rPr>
-        <w:t>GRACE-based storage estimates are useful because they integrate water mass across compartments rather than observing only the surface. Their spatial information is nevertheless much coarser than a nominal grid spacing may suggest. Replicating a parent mode</w:t>
-      </w:r>
-      <w:r>
-        <w:rPr>
-          <w:rFonts w:ascii="Times New Roman" w:hAnsi="Times New Roman"/>
-          <w:color w:val="000000"/>
-          <w:sz w:val="24"/>
-        </w:rPr>
-        <w:t>l cell onto smaller grid cells does not create new observations, and adjacent small basins may share most of their gravimetric information. This study therefore reports basin and grid results while retaining the limitation of shared spatial support.</w:t>
+        <w:t>GRACE-based storage estimates are useful because they integrate water mass across compartments rather than observing only the surface. Their spatial information is nevertheless much coarser than a nominal grid spacing may suggest. Replicating a parent model cell onto smaller grid cells does not create new observations, and adjacent small basins may share most of their gravimetric information. This study therefore reports basin and grid results while retaining the limitation of shared spatial support.</w:t>
       </w:r>
     </w:p>
     <w:p>
@@ -3924,23 +3756,7 @@
           <w:color w:val="000000"/>
           <w:sz w:val="24"/>
         </w:rPr>
-        <w:t>The su</w:t>
-      </w:r>
-      <w:r>
-        <w:rPr>
-          <w:rFonts w:ascii="Times New Roman" w:hAnsi="Times New Roman"/>
-          <w:color w:val="000000"/>
-          <w:sz w:val="24"/>
-        </w:rPr>
-        <w:t>pplied GRACE NetCDF declares centimetres, EPSG 4326 and nominal 0.25-degree sampling, but does not identify the processing centre, release or leakage correction. The calculations convert the declared units explicitly and preserve the input record, rather t</w:t>
-      </w:r>
-      <w:r>
-        <w:rPr>
-          <w:rFonts w:ascii="Times New Roman" w:hAnsi="Times New Roman"/>
-          <w:color w:val="000000"/>
-          <w:sz w:val="24"/>
-        </w:rPr>
-        <w:t>han guessing a mascon product. Quantitative magnitudes remain conditional on that supplied dataset. Recovery of the original processing metadata and comparison with another identified GRACE solution are required before definitive publication claims.</w:t>
+        <w:t>The supplied GRACE NetCDF declares centimetres, EPSG 4326 and nominal 0.25-degree sampling, but does not identify the processing centre, release or leakage correction. The calculations convert the declared units explicitly and preserve the input record, rather than guessing a mascon product. Quantitative magnitudes remain conditional on that supplied dataset. Recovery of the original processing metadata and comparison with another identified GRACE solution are required before definitive publication claims.</w:t>
       </w:r>
     </w:p>
     <w:p>
@@ -3952,18 +3768,12 @@
         </w:numPr>
         <w:spacing w:after="160"/>
       </w:pPr>
-      <w:bookmarkStart w:id="11" w:name="_Toc243747304"/>
-      <w:r>
-        <w:rPr>
-          <w:color w:val="000000"/>
-        </w:rPr>
-        <w:t>2.2 Gr</w:t>
-      </w:r>
-      <w:r>
-        <w:rPr>
-          <w:color w:val="000000"/>
-        </w:rPr>
-        <w:t>oundwater balance and head observations</w:t>
+      <w:bookmarkStart w:id="11" w:name="_Toc243756232"/>
+      <w:r>
+        <w:rPr>
+          <w:color w:val="000000"/>
+        </w:rPr>
+        <w:t>2.2 Groundwater balance and head observations</w:t>
       </w:r>
       <w:bookmarkEnd w:id="11"/>
     </w:p>
@@ -3978,23 +3788,7 @@
           <w:color w:val="000000"/>
           <w:sz w:val="24"/>
         </w:rPr>
-        <w:t>Groundwater anomalies are obtained by subtracting non-groundwater storage anomalies from TWSA, with all terms on compatible units, references and support. G3P illustrates the importance of combining gravimetry with c</w:t>
-      </w:r>
-      <w:r>
-        <w:rPr>
-          <w:rFonts w:ascii="Times New Roman" w:hAnsi="Times New Roman"/>
-          <w:color w:val="000000"/>
-          <w:sz w:val="24"/>
-        </w:rPr>
-        <w:t>ompartment estimates and documenting spatial filtering (Güntner et al., 2024). Different soil definitions or filters can produce different groundwater estimates even when the same gravimetric information is used. This study retains a filtered-soil sensitiv</w:t>
-      </w:r>
-      <w:r>
-        <w:rPr>
-          <w:rFonts w:ascii="Times New Roman" w:hAnsi="Times New Roman"/>
-          <w:color w:val="000000"/>
-          <w:sz w:val="24"/>
-        </w:rPr>
-        <w:t>ity and a related G3P groundwater product rather than treating one subtraction as exact truth.</w:t>
+        <w:t>Groundwater anomalies are obtained by subtracting non-groundwater storage anomalies from TWSA, with all terms on compatible units, references and support. G3P illustrates the importance of combining gravimetry with compartment estimates and documenting spatial filtering (Güntner et al., 2024). Different soil definitions or filters can produce different groundwater estimates even when the same gravimetric information is used. This study retains a filtered-soil sensitivity and a related G3P groundwater product rather than treating one subtraction as exact truth.</w:t>
       </w:r>
     </w:p>
     <w:p>
@@ -4008,23 +3802,7 @@
           <w:color w:val="000000"/>
           <w:sz w:val="24"/>
         </w:rPr>
-        <w:t>Groundwater head offers a separate observation type but not an automatic mass conversion. For an unconfined aquifer, storage change depends on specific yield and</w:t>
-      </w:r>
-      <w:r>
-        <w:rPr>
-          <w:rFonts w:ascii="Times New Roman" w:hAnsi="Times New Roman"/>
-          <w:color w:val="000000"/>
-          <w:sz w:val="24"/>
-        </w:rPr>
-        <w:t xml:space="preserve"> head change; confined storage requires an appropriate storage coefficient. Those coefficients, aquifer boundaries and representative spatial weights are not available for the Thai records used here. Correlation and direction checks are therefore used with</w:t>
-      </w:r>
-      <w:r>
-        <w:rPr>
-          <w:rFonts w:ascii="Times New Roman" w:hAnsi="Times New Roman"/>
-          <w:color w:val="000000"/>
-          <w:sz w:val="24"/>
-        </w:rPr>
-        <w:t>out inventing storage volumes or storage NSE against raw heads.</w:t>
+        <w:t>Groundwater head offers a separate observation type but not an automatic mass conversion. For an unconfined aquifer, storage change depends on specific yield and head change; confined storage requires an appropriate storage coefficient. Those coefficients, aquifer boundaries and representative spatial weights are not available for the Thai records used here. Correlation and direction checks are therefore used without inventing storage volumes or storage NSE against raw heads.</w:t>
       </w:r>
     </w:p>
     <w:p>
@@ -4036,7 +3814,7 @@
         </w:numPr>
         <w:spacing w:after="160"/>
       </w:pPr>
-      <w:bookmarkStart w:id="12" w:name="_Toc243747305"/>
+      <w:bookmarkStart w:id="12" w:name="_Toc243756233"/>
       <w:r>
         <w:rPr>
           <w:color w:val="000000"/>
@@ -4057,23 +3835,7 @@
           <w:color w:val="000000"/>
           <w:sz w:val="24"/>
         </w:rPr>
-        <w:t xml:space="preserve">WaterGAP provides a documented naturalized experiment in which direct water use is disabled and artificial reservoirs are removed, </w:t>
-      </w:r>
-      <w:r>
-        <w:rPr>
-          <w:rFonts w:ascii="Times New Roman" w:hAnsi="Times New Roman"/>
-          <w:color w:val="000000"/>
-          <w:sz w:val="24"/>
-        </w:rPr>
-        <w:t xml:space="preserve">alongside historical-human simulations driven by the same climate forcing (Müller Schmied et al., 2024). This offers a more explicit climate baseline than fitting observed total storage and naming the fitted part natural. It remains a model counterfactual </w:t>
-      </w:r>
-      <w:r>
-        <w:rPr>
-          <w:rFonts w:ascii="Times New Roman" w:hAnsi="Times New Roman"/>
-          <w:color w:val="000000"/>
-          <w:sz w:val="24"/>
-        </w:rPr>
-        <w:t>conditional on forcing, parameters, routing and land representation. The paired difference identifies modeled direct human effects, not an independently measured pumping history.</w:t>
+        <w:t>WaterGAP provides a documented naturalized experiment in which direct water use is disabled and artificial reservoirs are removed, alongside historical-human simulations driven by the same climate forcing (Müller Schmied et al., 2024). This offers a more explicit climate baseline than fitting observed total storage and naming the fitted part natural. It remains a model counterfactual conditional on forcing, parameters, routing and land representation. The paired difference identifies modeled direct human effects, not an independently measured pumping history.</w:t>
       </w:r>
     </w:p>
     <w:p>
@@ -4087,23 +3849,7 @@
           <w:color w:val="000000"/>
           <w:sz w:val="24"/>
         </w:rPr>
-        <w:t xml:space="preserve">GLDAS supplies another hydrological perspective but its model structure must </w:t>
-      </w:r>
-      <w:r>
-        <w:rPr>
-          <w:rFonts w:ascii="Times New Roman" w:hAnsi="Times New Roman"/>
-          <w:color w:val="000000"/>
-          <w:sz w:val="24"/>
-        </w:rPr>
-        <w:t xml:space="preserve">be respected. Noah land storage contains soil, canopy and snow, without a groundwater compartment (Rodell et al., 2004; NASA, n.d.). The revised benchmark compares matching compartment types rather than demanding that Noah validate full TWSA or GWSA. Soil </w:t>
-      </w:r>
-      <w:r>
-        <w:rPr>
-          <w:rFonts w:ascii="Times New Roman" w:hAnsi="Times New Roman"/>
-          <w:color w:val="000000"/>
-          <w:sz w:val="24"/>
-        </w:rPr>
-        <w:t>column definitions still differ across models, so even this comparison is cross-model consistency rather than observational truth.</w:t>
+        <w:t>GLDAS supplies another hydrological perspective but its model structure must be respected. Noah land storage contains soil, canopy and snow, without a groundwater compartment (Rodell et al., 2004; NASA, n.d.). The revised benchmark compares matching compartment types rather than demanding that Noah validate full TWSA or GWSA. Soil column definitions still differ across models, so even this comparison is cross-model consistency rather than observational truth.</w:t>
       </w:r>
     </w:p>
     <w:p>
@@ -4115,7 +3861,7 @@
         </w:numPr>
         <w:spacing w:after="160"/>
       </w:pPr>
-      <w:bookmarkStart w:id="13" w:name="_Toc243747306"/>
+      <w:bookmarkStart w:id="13" w:name="_Toc243756234"/>
       <w:r>
         <w:rPr>
           <w:color w:val="000000"/>
@@ -4135,23 +3881,7 @@
           <w:color w:val="000000"/>
           <w:sz w:val="24"/>
         </w:rPr>
-        <w:t>Seasonality, missing observations and serial dependence complicate hydrological trend assessment. Seasona</w:t>
-      </w:r>
-      <w:r>
-        <w:rPr>
-          <w:rFonts w:ascii="Times New Roman" w:hAnsi="Times New Roman"/>
-          <w:color w:val="000000"/>
-          <w:sz w:val="24"/>
-        </w:rPr>
-        <w:t>l rank methods reduce the influence of within-year cycling, but ordinary seasonal Mann–Kendall significance does not remove all temporal dependence (Hirsch et al., 1982; Hirsch &amp; Slack, 1984). False-discovery-rate adjustment addresses multiple comparisons,</w:t>
-      </w:r>
-      <w:r>
-        <w:rPr>
-          <w:rFonts w:ascii="Times New Roman" w:hAnsi="Times New Roman"/>
-          <w:color w:val="000000"/>
-          <w:sz w:val="24"/>
-        </w:rPr>
-        <w:t xml:space="preserve"> not common GRACE spatial support. Robust slopes, annual checks and block-bootstrap intervals are consequently reported together rather than interpreting a small p-value as a causal result.</w:t>
+        <w:t>Seasonality, missing observations and serial dependence complicate hydrological trend assessment. Seasonal rank methods reduce the influence of within-year cycling, but ordinary seasonal Mann–Kendall significance does not remove all temporal dependence (Hirsch et al., 1982; Hirsch &amp; Slack, 1984). False-discovery-rate adjustment addresses multiple comparisons, not common GRACE spatial support. Robust slopes, annual checks and block-bootstrap intervals are consequently reported together rather than interpreting a small p-value as a causal result.</w:t>
       </w:r>
     </w:p>
     <w:p>
@@ -4168,7 +3898,7 @@
         </w:numPr>
         <w:spacing w:after="480"/>
       </w:pPr>
-      <w:bookmarkStart w:id="14" w:name="_Toc243747307"/>
+      <w:bookmarkStart w:id="14" w:name="_Toc243756235"/>
       <w:r>
         <w:rPr>
           <w:color w:val="000000"/>
@@ -4194,7 +3924,7 @@
         </w:numPr>
         <w:spacing w:after="160"/>
       </w:pPr>
-      <w:bookmarkStart w:id="15" w:name="_Toc243747308"/>
+      <w:bookmarkStart w:id="15" w:name="_Toc243756236"/>
       <w:r>
         <w:rPr>
           <w:color w:val="000000"/>
@@ -4214,23 +3944,7 @@
           <w:color w:val="000000"/>
           <w:sz w:val="24"/>
         </w:rPr>
-        <w:t>The project uses t</w:t>
-      </w:r>
-      <w:r>
-        <w:rPr>
-          <w:rFonts w:ascii="Times New Roman" w:hAnsi="Times New Roman"/>
-          <w:color w:val="000000"/>
-          <w:sz w:val="24"/>
-        </w:rPr>
-        <w:t>he supplied ONWR principal-basin shapefile and authoritative polygon–grid intersection weights. Six separately coded island features are assigned to their parent basin for map geometry and well assignment. Observational inputs include GRACE TWSA, GLDAS Noa</w:t>
-      </w:r>
-      <w:r>
-        <w:rPr>
-          <w:rFonts w:ascii="Times New Roman" w:hAnsi="Times New Roman"/>
-          <w:color w:val="000000"/>
-          <w:sz w:val="24"/>
-        </w:rPr>
-        <w:t>h soil/canopy/snow storage, G3P modeled surface water, and previously harmonized CHIRPS, GLEAM, MODIS and ESA CCI predictors. Original inputs, source subsets, acquisition provenance and analysis scripts remain available in the local project.</w:t>
+        <w:t>The project uses the supplied ONWR principal-basin shapefile and authoritative polygon–grid intersection weights. Six separately coded island features are assigned to their parent basin for map geometry and well assignment. Observational inputs include GRACE TWSA, GLDAS Noah soil/canopy/snow storage, G3P modeled surface water, and previously harmonized CHIRPS, GLEAM, MODIS and ESA CCI predictors. Original inputs, source subsets, acquisition provenance and analysis scripts remain available in the local project.</w:t>
       </w:r>
     </w:p>
     <w:p>
@@ -4244,31 +3958,7 @@
           <w:color w:val="000000"/>
           <w:sz w:val="24"/>
         </w:rPr>
-        <w:t>The revised cl</w:t>
-      </w:r>
-      <w:r>
-        <w:rPr>
-          <w:rFonts w:ascii="Times New Roman" w:hAnsi="Times New Roman"/>
-          <w:color w:val="000000"/>
-          <w:sz w:val="24"/>
-        </w:rPr>
-        <w:t>imate baseline uses public WaterGAP 2.2e GSWP3–ERA5 naturalized and historical-human outputs ending December 2023. Ten variable/scenario subsets were extracted from publisher-supported byte ranges and retained with source identifiers and checksums. The sou</w:t>
-      </w:r>
-      <w:r>
-        <w:rPr>
-          <w:rFonts w:ascii="Times New Roman" w:hAnsi="Times New Roman"/>
-          <w:color w:val="000000"/>
-          <w:sz w:val="24"/>
-        </w:rPr>
-        <w:t>rce uses a synthetic 360-day calendar for monthly labels; year and month identities were mapped to month starts without generating daily values or interpolating observations. Meteorological rates were converted to mean mm/day for the emulator predictors, a</w:t>
-      </w:r>
-      <w:r>
-        <w:rPr>
-          <w:rFonts w:ascii="Times New Roman" w:hAnsi="Times New Roman"/>
-          <w:color w:val="000000"/>
-          <w:sz w:val="24"/>
-        </w:rPr>
-        <w:t>voiding an assumed conversion from synthetic months to physical monthly totals.</w:t>
+        <w:t>The revised climate baseline uses public WaterGAP 2.2e GSWP3–ERA5 naturalized and historical-human outputs ending December 2023. Ten variable/scenario subsets were extracted from publisher-supported byte ranges and retained with source identifiers and checksums. The source uses a synthetic 360-day calendar for monthly labels; year and month identities were mapped to month starts without generating daily values or interpolating observations. Meteorological rates were converted to mean mm/day for the emulator predictors, avoiding an assumed conversion from synthetic months to physical monthly totals.</w:t>
       </w:r>
     </w:p>
     <w:p>
@@ -4280,7 +3970,7 @@
         </w:numPr>
         <w:spacing w:after="160"/>
       </w:pPr>
-      <w:bookmarkStart w:id="16" w:name="_Toc243747309"/>
+      <w:bookmarkStart w:id="16" w:name="_Toc243756237"/>
       <w:r>
         <w:rPr>
           <w:color w:val="000000"/>
@@ -4300,23 +3990,7 @@
           <w:color w:val="000000"/>
           <w:sz w:val="24"/>
         </w:rPr>
-        <w:t>Every groundwater balance term is expressed in millimetres of equivalent water height and rebased to the common 2004–2009 reference. Reg</w:t>
-      </w:r>
-      <w:r>
-        <w:rPr>
-          <w:rFonts w:ascii="Times New Roman" w:hAnsi="Times New Roman"/>
-          <w:color w:val="000000"/>
-          <w:sz w:val="24"/>
-        </w:rPr>
-        <w:t>ional compartment exports use the identical groundwater-valid cells and months, with the corresponding TWSA exported as TWSA_GWS_reference. Soil moisture includes the four GLDAS Noah layers; surface water includes modeled rivers, lakes and reservoirs. Cano</w:t>
-      </w:r>
-      <w:r>
-        <w:rPr>
-          <w:rFonts w:ascii="Times New Roman" w:hAnsi="Times New Roman"/>
-          <w:color w:val="000000"/>
-          <w:sz w:val="24"/>
-        </w:rPr>
-        <w:t>py and snow are retained rather than silently assumed zero.</w:t>
+        <w:t>Every groundwater balance term is expressed in millimetres of equivalent water height and rebased to the common 2004–2009 reference. Regional compartment exports use the identical groundwater-valid cells and months, with the corresponding TWSA exported as TWSA_GWS_reference. Soil moisture includes the four GLDAS Noah layers; surface water includes modeled rivers, lakes and reservoirs. Canopy and snow are retained rather than silently assumed zero.</w:t>
       </w:r>
     </w:p>
     <w:p>
@@ -4330,23 +4004,7 @@
           <w:color w:val="000000"/>
           <w:sz w:val="24"/>
         </w:rPr>
-        <w:t xml:space="preserve">Primary observed and model components are compared on a common valid footprint, with a minimum 50 percent basin-area threshold for the revised attribution. The original trend analysis retains its </w:t>
-      </w:r>
-      <w:r>
-        <w:rPr>
-          <w:rFonts w:ascii="Times New Roman" w:hAnsi="Times New Roman"/>
-          <w:color w:val="000000"/>
-          <w:sz w:val="24"/>
-        </w:rPr>
-        <w:t xml:space="preserve">own documented coverage policy, so its full-record slopes need not equal the shorter common-support slopes. Parent-cell replication is used only for aligned grids and adds no information. Component filtering differences, soil depth differences and coastal </w:t>
-      </w:r>
-      <w:r>
-        <w:rPr>
-          <w:rFonts w:ascii="Times New Roman" w:hAnsi="Times New Roman"/>
-          <w:color w:val="000000"/>
-          <w:sz w:val="24"/>
-        </w:rPr>
-        <w:t>leakage remain structural uncertainties.</w:t>
+        <w:t>Primary observed and model components are compared on a common valid footprint, with a minimum 50 percent basin-area threshold for the revised attribution. The original trend analysis retains its own documented coverage policy, so its full-record slopes need not equal the shorter common-support slopes. Parent-cell replication is used only for aligned grids and adds no information. Component filtering differences, soil depth differences and coastal leakage remain structural uncertainties.</w:t>
       </w:r>
     </w:p>
     <w:p>
@@ -4416,49 +4074,7 @@
             <w:rPr>
               <w:rFonts w:ascii="Cambria Math" w:hAnsi="Cambria Math"/>
             </w:rPr>
-            <m:t xml:space="preserve"> - </m:t>
-          </m:r>
-          <m:r>
-            <w:rPr>
-              <w:rFonts w:ascii="Cambria Math" w:hAnsi="Cambria Math"/>
-            </w:rPr>
-            <m:t>SMSA</m:t>
-          </m:r>
-          <m:r>
-            <w:rPr>
-              <w:rFonts w:ascii="Cambria Math" w:hAnsi="Cambria Math"/>
-            </w:rPr>
-            <m:t xml:space="preserve"> - </m:t>
-          </m:r>
-          <m:r>
-            <w:rPr>
-              <w:rFonts w:ascii="Cambria Math" w:hAnsi="Cambria Math"/>
-            </w:rPr>
-            <m:t>SWSA</m:t>
-          </m:r>
-          <m:r>
-            <w:rPr>
-              <w:rFonts w:ascii="Cambria Math" w:hAnsi="Cambria Math"/>
-            </w:rPr>
-            <m:t xml:space="preserve"> - </m:t>
-          </m:r>
-          <m:r>
-            <w:rPr>
-              <w:rFonts w:ascii="Cambria Math" w:hAnsi="Cambria Math"/>
-            </w:rPr>
-            <m:t>CWSA</m:t>
-          </m:r>
-          <m:r>
-            <w:rPr>
-              <w:rFonts w:ascii="Cambria Math" w:hAnsi="Cambria Math"/>
-            </w:rPr>
-            <m:t xml:space="preserve"> - </m:t>
-          </m:r>
-          <m:r>
-            <w:rPr>
-              <w:rFonts w:ascii="Cambria Math" w:hAnsi="Cambria Math"/>
-            </w:rPr>
-            <m:t>SWEA</m:t>
+            <m:t xml:space="preserve"> - SMSA - SWSA - CWSA - SWEA</m:t>
           </m:r>
         </m:oMath>
       </m:oMathPara>
@@ -4472,7 +4088,7 @@
         </w:numPr>
         <w:spacing w:after="160"/>
       </w:pPr>
-      <w:bookmarkStart w:id="17" w:name="_Toc243747310"/>
+      <w:bookmarkStart w:id="17" w:name="_Toc243756238"/>
       <w:r>
         <w:rPr>
           <w:color w:val="000000"/>
@@ -4493,23 +4109,7 @@
           <w:color w:val="000000"/>
           <w:sz w:val="24"/>
         </w:rPr>
-        <w:t>Let O denote observed storage, C the naturalized model, and A the paired historical-human model. Th</w:t>
-      </w:r>
-      <w:r>
-        <w:rPr>
-          <w:rFonts w:ascii="Times New Roman" w:hAnsi="Times New Roman"/>
-          <w:color w:val="000000"/>
-          <w:sz w:val="24"/>
-        </w:rPr>
-        <w:t>e observation-based residual is R = O − C, the modeled direct-human effect is H = A − C, and model discrepancy is E = O − A. On identical support, R = H + E exactly. This identity prevents the entire residual from being assigned to humans when the historic</w:t>
-      </w:r>
-      <w:r>
-        <w:rPr>
-          <w:rFonts w:ascii="Times New Roman" w:hAnsi="Times New Roman"/>
-          <w:color w:val="000000"/>
-          <w:sz w:val="24"/>
-        </w:rPr>
-        <w:t>al-human model still differs substantially from observations.</w:t>
+        <w:t>Let O denote observed storage, C the naturalized model, and A the paired historical-human model. The observation-based residual is R = O − C, the modeled direct-human effect is H = A − C, and model discrepancy is E = O − A. On identical support, R = H + E exactly. This identity prevents the entire residual from being assigned to humans when the historical-human model still differs substantially from observations.</w:t>
       </w:r>
     </w:p>
     <w:p>
@@ -4523,23 +4123,7 @@
           <w:color w:val="000000"/>
           <w:sz w:val="24"/>
         </w:rPr>
-        <w:t>Naturalized and historical-human simulations are each rebased on the same observed reference months. Consequently H describes the change in modeled human influence relative to the reference peri</w:t>
-      </w:r>
-      <w:r>
-        <w:rPr>
-          <w:rFonts w:ascii="Times New Roman" w:hAnsi="Times New Roman"/>
-          <w:color w:val="000000"/>
-          <w:sz w:val="24"/>
-        </w:rPr>
-        <w:t>od; it is not cumulative depletion since the beginning of development. No hydrological model values beyond December 2023 are invented. The published physical simulation supplies the primary counterfactual, while statistical emulators test how well meteorol</w:t>
-      </w:r>
-      <w:r>
-        <w:rPr>
-          <w:rFonts w:ascii="Times New Roman" w:hAnsi="Times New Roman"/>
-          <w:color w:val="000000"/>
-          <w:sz w:val="24"/>
-        </w:rPr>
-        <w:t>ogical information reproduces that simulation.</w:t>
+        <w:t>Naturalized and historical-human simulations are each rebased on the same observed reference months. Consequently H describes the change in modeled human influence relative to the reference period; it is not cumulative depletion since the beginning of development. No hydrological model values beyond December 2023 are invented. The published physical simulation supplies the primary counterfactual, while statistical emulators test how well meteorological information reproduces that simulation.</w:t>
       </w:r>
     </w:p>
     <w:p>
@@ -4553,103 +4137,7 @@
             <w:rPr>
               <w:rFonts w:ascii="Cambria Math" w:hAnsi="Cambria Math"/>
             </w:rPr>
-            <m:t>R</m:t>
-          </m:r>
-          <m:r>
-            <w:rPr>
-              <w:rFonts w:ascii="Cambria Math" w:hAnsi="Cambria Math"/>
-            </w:rPr>
-            <m:t xml:space="preserve"> = </m:t>
-          </m:r>
-          <m:r>
-            <w:rPr>
-              <w:rFonts w:ascii="Cambria Math" w:hAnsi="Cambria Math"/>
-            </w:rPr>
-            <m:t>O</m:t>
-          </m:r>
-          <m:r>
-            <w:rPr>
-              <w:rFonts w:ascii="Cambria Math" w:hAnsi="Cambria Math"/>
-            </w:rPr>
-            <m:t xml:space="preserve"> - </m:t>
-          </m:r>
-          <m:r>
-            <w:rPr>
-              <w:rFonts w:ascii="Cambria Math" w:hAnsi="Cambria Math"/>
-            </w:rPr>
-            <m:t>C</m:t>
-          </m:r>
-          <m:r>
-            <w:rPr>
-              <w:rFonts w:ascii="Cambria Math" w:hAnsi="Cambria Math"/>
-            </w:rPr>
-            <m:t xml:space="preserve"> = (</m:t>
-          </m:r>
-          <m:r>
-            <w:rPr>
-              <w:rFonts w:ascii="Cambria Math" w:hAnsi="Cambria Math"/>
-            </w:rPr>
-            <m:t>A</m:t>
-          </m:r>
-          <m:r>
-            <w:rPr>
-              <w:rFonts w:ascii="Cambria Math" w:hAnsi="Cambria Math"/>
-            </w:rPr>
-            <m:t xml:space="preserve"> - </m:t>
-          </m:r>
-          <m:r>
-            <w:rPr>
-              <w:rFonts w:ascii="Cambria Math" w:hAnsi="Cambria Math"/>
-            </w:rPr>
-            <m:t>C</m:t>
-          </m:r>
-          <m:r>
-            <w:rPr>
-              <w:rFonts w:ascii="Cambria Math" w:hAnsi="Cambria Math"/>
-            </w:rPr>
-            <m:t>) + (</m:t>
-          </m:r>
-          <m:r>
-            <w:rPr>
-              <w:rFonts w:ascii="Cambria Math" w:hAnsi="Cambria Math"/>
-            </w:rPr>
-            <m:t>O</m:t>
-          </m:r>
-          <m:r>
-            <w:rPr>
-              <w:rFonts w:ascii="Cambria Math" w:hAnsi="Cambria Math"/>
-            </w:rPr>
-            <m:t xml:space="preserve"> - </m:t>
-          </m:r>
-          <m:r>
-            <w:rPr>
-              <w:rFonts w:ascii="Cambria Math" w:hAnsi="Cambria Math"/>
-            </w:rPr>
-            <m:t>A</m:t>
-          </m:r>
-          <m:r>
-            <w:rPr>
-              <w:rFonts w:ascii="Cambria Math" w:hAnsi="Cambria Math"/>
-            </w:rPr>
-            <m:t xml:space="preserve">) = </m:t>
-          </m:r>
-          <m:r>
-            <w:rPr>
-              <w:rFonts w:ascii="Cambria Math" w:hAnsi="Cambria Math"/>
-            </w:rPr>
-            <m:t>H</m:t>
-          </m:r>
-          <m:r>
-            <w:rPr>
-              <w:rFonts w:ascii="Cambria Math" w:hAnsi="Cambria Math"/>
-            </w:rPr>
-            <m:t xml:space="preserve"> + </m:t>
-          </m:r>
-          <m:r>
-            <w:rPr>
-              <w:rFonts w:ascii="Cambria Math" w:hAnsi="Cambria Math"/>
-            </w:rPr>
-            <m:t>E</m:t>
+            <m:t>R = O - C = (A - C) + (O - A) = H + E</m:t>
           </m:r>
         </m:oMath>
       </m:oMathPara>
@@ -4663,7 +4151,7 @@
         </w:numPr>
         <w:spacing w:after="160"/>
       </w:pPr>
-      <w:bookmarkStart w:id="18" w:name="_Toc243747311"/>
+      <w:bookmarkStart w:id="18" w:name="_Toc243756239"/>
       <w:r>
         <w:rPr>
           <w:color w:val="000000"/>
@@ -4683,23 +4171,7 @@
           <w:color w:val="000000"/>
           <w:sz w:val="24"/>
         </w:rPr>
-        <w:t xml:space="preserve">The emulator predictors are meteorological precipitation, potential evapotranspiration, causal lags, </w:t>
-      </w:r>
-      <w:r>
-        <w:rPr>
-          <w:rFonts w:ascii="Times New Roman" w:hAnsi="Times New Roman"/>
-          <w:color w:val="000000"/>
-          <w:sz w:val="24"/>
-        </w:rPr>
-        <w:t>antecedent exponential memory indices and annual/semiannual harmonics. Lags of 0, 1, 2, 3, 6 and 12 months and memory constants of 1, 3, 6, 12 and 24 months represent immediate and delayed response. No GRACE lag, observed well level or unrestricted calenda</w:t>
-      </w:r>
-      <w:r>
-        <w:rPr>
-          <w:rFonts w:ascii="Times New Roman" w:hAnsi="Times New Roman"/>
-          <w:color w:val="000000"/>
-          <w:sz w:val="24"/>
-        </w:rPr>
-        <w:t>r-year trend is included. This prevents an apparent improvement obtained simply by learning an observed depletion trend.</w:t>
+        <w:t>The emulator predictors are meteorological precipitation, potential evapotranspiration, causal lags, antecedent exponential memory indices and annual/semiannual harmonics. Lags of 0, 1, 2, 3, 6 and 12 months and memory constants of 1, 3, 6, 12 and 24 months represent immediate and delayed response. No GRACE lag, observed well level or unrestricted calendar-year trend is included. This prevents an apparent improvement obtained simply by learning an observed depletion trend.</w:t>
       </w:r>
     </w:p>
     <w:p>
@@ -4713,23 +4185,7 @@
           <w:color w:val="000000"/>
           <w:sz w:val="24"/>
         </w:rPr>
-        <w:t>The years 1981–1990 provide warm-up, 1991–2009 training, 2010–2015 validation and 2016–2023 the untouched test. Ridge, ElasticNet, addi</w:t>
-      </w:r>
-      <w:r>
-        <w:rPr>
-          <w:rFonts w:ascii="Times New Roman" w:hAnsi="Times New Roman"/>
-          <w:color w:val="000000"/>
-          <w:sz w:val="24"/>
-        </w:rPr>
-        <w:t xml:space="preserve">tive splines and Random Forest are tuned using two chronological folds within training. Scaling and spline transformations are fitted only in each training fold. Validation selects up to three members that improve on training climatology and have positive </w:t>
-      </w:r>
-      <w:r>
-        <w:rPr>
-          <w:rFonts w:ascii="Times New Roman" w:hAnsi="Times New Roman"/>
-          <w:color w:val="000000"/>
-          <w:sz w:val="24"/>
-        </w:rPr>
-        <w:t>deseasonalized NSE; inverse-validation-error weights are then frozen before testing.</w:t>
+        <w:t>The years 1981–1990 provide warm-up, 1991–2009 training, 2010–2015 validation and 2016–2023 the untouched test. Ridge, ElasticNet, additive splines and Random Forest are tuned using two chronological folds within training. Scaling and spline transformations are fitted only in each training fold. Validation selects up to three members that improve on training climatology and have positive deseasonalized NSE; inverse-validation-error weights are then frozen before testing.</w:t>
       </w:r>
     </w:p>
     <w:p>
@@ -4743,23 +4199,7 @@
           <w:color w:val="000000"/>
           <w:sz w:val="24"/>
         </w:rPr>
-        <w:t>Monthly NSE, r, RMSE, bias and skill relative to training climatology are reported. Deseasonalized performance subtracts the same training-derived calendar-month reference</w:t>
-      </w:r>
-      <w:r>
-        <w:rPr>
-          <w:rFonts w:ascii="Times New Roman" w:hAnsi="Times New Roman"/>
-          <w:color w:val="000000"/>
-          <w:sz w:val="24"/>
-        </w:rPr>
-        <w:t xml:space="preserve"> from target and prediction, preserving prediction bias. These are emulator-verification scores against naturalized model output and must not be relabelled independent groundwater validation. The original GRACE-trained M0–M4 experiments remain a separate e</w:t>
-      </w:r>
-      <w:r>
-        <w:rPr>
-          <w:rFonts w:ascii="Times New Roman" w:hAnsi="Times New Roman"/>
-          <w:color w:val="000000"/>
-          <w:sz w:val="24"/>
-        </w:rPr>
-        <w:t xml:space="preserve">mpirical </w:t>
+        <w:t xml:space="preserve">Monthly NSE, r, RMSE, bias and skill relative to training climatology are reported. Deseasonalized performance subtracts the same training-derived calendar-month reference from target and prediction, preserving prediction bias. These are emulator-verification scores against naturalized model output and must not be relabelled independent groundwater validation. The original GRACE-trained M0–M4 experiments remain a separate empirical </w:t>
       </w:r>
       <w:r>
         <w:rPr>
@@ -4780,7 +4220,7 @@
         </w:numPr>
         <w:spacing w:after="160"/>
       </w:pPr>
-      <w:bookmarkStart w:id="19" w:name="_Toc243747312"/>
+      <w:bookmarkStart w:id="19" w:name="_Toc243756240"/>
       <w:r>
         <w:rPr>
           <w:color w:val="000000"/>
@@ -4800,23 +4240,7 @@
           <w:color w:val="000000"/>
           <w:sz w:val="24"/>
         </w:rPr>
-        <w:t xml:space="preserve">The groundwater extraction contains 5,484 observed aggregates from 511 wells: 5,259 annual aggregates </w:t>
-      </w:r>
-      <w:r>
-        <w:rPr>
-          <w:rFonts w:ascii="Times New Roman" w:hAnsi="Times New Roman"/>
-          <w:color w:val="000000"/>
-          <w:sz w:val="24"/>
-        </w:rPr>
-        <w:t>from 506 wells and 225 monthly aggregates from five wells. Positive depth below ground is converted to signed head by negation. Per-well standardized anomalies are descriptive indices, and co-located wells are collapsed into coordinate-station groups befor</w:t>
-      </w:r>
-      <w:r>
-        <w:rPr>
-          <w:rFonts w:ascii="Times New Roman" w:hAnsi="Times New Roman"/>
-          <w:color w:val="000000"/>
-          <w:sz w:val="24"/>
-        </w:rPr>
-        <w:t>e equal-weight basin aggregation. Annual observations remain annual; the source typically aggregates only two readings in a year.</w:t>
+        <w:t>The groundwater extraction contains 5,484 observed aggregates from 511 wells: 5,259 annual aggregates from 506 wells and 225 monthly aggregates from five wells. Positive depth below ground is converted to signed head by negation. Per-well standardized anomalies are descriptive indices, and co-located wells are collapsed into coordinate-station groups before equal-weight basin aggregation. Annual observations remain annual; the source typically aggregates only two readings in a year.</w:t>
       </w:r>
     </w:p>
     <w:p>
@@ -4830,23 +4254,7 @@
           <w:color w:val="000000"/>
           <w:sz w:val="24"/>
         </w:rPr>
-        <w:t xml:space="preserve">Annual comparisons require at least eight observed storage months and exclude incomplete endpoint years. Raw annual agreement </w:t>
-      </w:r>
-      <w:r>
-        <w:rPr>
-          <w:rFonts w:ascii="Times New Roman" w:hAnsi="Times New Roman"/>
-          <w:color w:val="000000"/>
-          <w:sz w:val="24"/>
-        </w:rPr>
-        <w:t>is supplemented by partial correlation controlling naturalized climate, linear detrending and differences between consecutive observed years only. At least six annual pairs are required for raw correlations and eight for partial/detrended checks. Provider-</w:t>
-      </w:r>
-      <w:r>
-        <w:rPr>
-          <w:rFonts w:ascii="Times New Roman" w:hAnsi="Times New Roman"/>
-          <w:color w:val="000000"/>
-          <w:sz w:val="24"/>
-        </w:rPr>
-        <w:t>flag exclusion and a fixed-eligibility panel test sensitivity to record quality and observation-network composition.</w:t>
+        <w:t>Annual comparisons require at least eight observed storage months and exclude incomplete endpoint years. Raw annual agreement is supplemented by partial correlation controlling naturalized climate, linear detrending and differences between consecutive observed years only. At least six annual pairs are required for raw correlations and eight for partial/detrended checks. Provider-flag exclusion and a fixed-eligibility panel test sensitivity to record quality and observation-network composition.</w:t>
       </w:r>
     </w:p>
     <w:p>
@@ -4860,23 +4268,7 @@
           <w:color w:val="000000"/>
           <w:sz w:val="24"/>
         </w:rPr>
-        <w:t>These checks test consistency rather than human pumping volumes. A groundwater head index can support or challenge the groundwater residual</w:t>
-      </w:r>
-      <w:r>
-        <w:rPr>
-          <w:rFonts w:ascii="Times New Roman" w:hAnsi="Times New Roman"/>
-          <w:color w:val="000000"/>
-          <w:sz w:val="24"/>
-        </w:rPr>
-        <w:t xml:space="preserve"> interpretation, but it cannot observe river, reservoir or soil contributions to human TWSA. Even a positive groundwater correlation can reflect shared climate or trend, which motivates the additional checks. Missing aquifer metadata and storage coefficien</w:t>
-      </w:r>
-      <w:r>
-        <w:rPr>
-          <w:rFonts w:ascii="Times New Roman" w:hAnsi="Times New Roman"/>
-          <w:color w:val="000000"/>
-          <w:sz w:val="24"/>
-        </w:rPr>
-        <w:t>ts prevent direct conversion from head to groundwater mass.</w:t>
+        <w:t>These checks test consistency rather than human pumping volumes. A groundwater head index can support or challenge the groundwater residual interpretation, but it cannot observe river, reservoir or soil contributions to human TWSA. Even a positive groundwater correlation can reflect shared climate or trend, which motivates the additional checks. Missing aquifer metadata and storage coefficients prevent direct conversion from head to groundwater mass.</w:t>
       </w:r>
     </w:p>
     <w:p>
@@ -4946,19 +4338,7 @@
             <w:rPr>
               <w:rFonts w:ascii="Cambria Math" w:hAnsi="Cambria Math"/>
             </w:rPr>
-            <m:t xml:space="preserve"> </m:t>
-          </m:r>
-          <m:r>
-            <w:rPr>
-              <w:rFonts w:ascii="Cambria Math" w:hAnsi="Cambria Math"/>
-            </w:rPr>
-            <m:t>Δ</m:t>
-          </m:r>
-          <m:r>
-            <w:rPr>
-              <w:rFonts w:ascii="Cambria Math" w:hAnsi="Cambria Math"/>
-            </w:rPr>
-            <m:t>h</m:t>
+            <m:t xml:space="preserve"> Δh</m:t>
           </m:r>
         </m:oMath>
       </m:oMathPara>
@@ -4972,7 +4352,7 @@
         </w:numPr>
         <w:spacing w:after="160"/>
       </w:pPr>
-      <w:bookmarkStart w:id="20" w:name="_Toc243747313"/>
+      <w:bookmarkStart w:id="20" w:name="_Toc243756241"/>
       <w:r>
         <w:rPr>
           <w:color w:val="000000"/>
@@ -4992,23 +4372,7 @@
           <w:color w:val="000000"/>
           <w:sz w:val="24"/>
         </w:rPr>
-        <w:t>Seasonal Sen slopes use same-calendar-month pairs and actual elapsed years. Original and seasonal Mann–Kendall, annual tests and false-</w:t>
-      </w:r>
-      <w:r>
-        <w:rPr>
-          <w:rFonts w:ascii="Times New Roman" w:hAnsi="Times New Roman"/>
-          <w:color w:val="000000"/>
-          <w:sz w:val="24"/>
-        </w:rPr>
-        <w:t>discovery-rate q-values are retained; annual serial-correlation correction is reported only when annual records are contiguous. Original basin slope intervals use 300 calendar-year residual-block resamples, while the revised component analysis uses 100 exp</w:t>
-      </w:r>
-      <w:r>
-        <w:rPr>
-          <w:rFonts w:ascii="Times New Roman" w:hAnsi="Times New Roman"/>
-          <w:color w:val="000000"/>
-          <w:sz w:val="24"/>
-        </w:rPr>
-        <w:t>loratory resamples. These intervals do not propagate all observation, forcing and structural errors.</w:t>
+        <w:t>Seasonal Sen slopes use same-calendar-month pairs and actual elapsed years. Original and seasonal Mann–Kendall, annual tests and false-discovery-rate q-values are retained; annual serial-correlation correction is reported only when annual records are contiguous. Original basin slope intervals use 300 calendar-year residual-block resamples, while the revised component analysis uses 100 exploratory resamples. These intervals do not propagate all observation, forcing and structural errors.</w:t>
       </w:r>
     </w:p>
     <w:p>
@@ -5022,7 +4386,7 @@
           <w:color w:val="000000"/>
           <w:sz w:val="24"/>
         </w:rPr>
-        <w:t>Sen slopes of components are not additive because a median is not a linear operator. An additional trend partition therefore uses ordinary least squares wi</w:t>
+        <w:t xml:space="preserve">Sen slopes of components are not additive because a median is not a linear operator. An additional trend partition therefore uses ordinary least squares with calendar-month fixed </w:t>
       </w:r>
       <w:r>
         <w:rPr>
@@ -5030,24 +4394,8 @@
           <w:color w:val="000000"/>
           <w:sz w:val="24"/>
         </w:rPr>
-        <w:t xml:space="preserve">th calendar-month fixed </w:t>
-      </w:r>
-      <w:r>
-        <w:rPr>
-          <w:rFonts w:ascii="Times New Roman" w:hAnsi="Times New Roman"/>
-          <w:color w:val="000000"/>
-          <w:sz w:val="24"/>
-        </w:rPr>
         <w:lastRenderedPageBreak/>
-        <w:t xml:space="preserve">effects and identical observed dates. Its point slopes satisfy the component identities exactly, but the coefficients are not causal fractions. No percentage of human depletion is reported simply by dividing a residual Sen slope by </w:t>
-      </w:r>
-      <w:r>
-        <w:rPr>
-          <w:rFonts w:ascii="Times New Roman" w:hAnsi="Times New Roman"/>
-          <w:color w:val="000000"/>
-          <w:sz w:val="24"/>
-        </w:rPr>
-        <w:t>the observed Sen slope.</w:t>
+        <w:t>effects and identical observed dates. Its point slopes satisfy the component identities exactly, but the coefficients are not causal fractions. No percentage of human depletion is reported simply by dividing a residual Sen slope by the observed Sen slope.</w:t>
       </w:r>
     </w:p>
     <w:p>
@@ -5059,7 +4407,7 @@
         </w:numPr>
         <w:spacing w:after="160"/>
       </w:pPr>
-      <w:bookmarkStart w:id="21" w:name="_Toc243747314"/>
+      <w:bookmarkStart w:id="21" w:name="_Toc243756242"/>
       <w:r>
         <w:rPr>
           <w:color w:val="000000"/>
@@ -5079,23 +4427,7 @@
           <w:color w:val="000000"/>
           <w:sz w:val="24"/>
         </w:rPr>
-        <w:t>The decision-support system is a static, publicly hosted GitHub Pages application using Leaflet and ECharts. It presents the 22 principal basins plus national context, storage selection, tren</w:t>
-      </w:r>
-      <w:r>
-        <w:rPr>
-          <w:rFonts w:ascii="Times New Roman" w:hAnsi="Times New Roman"/>
-          <w:color w:val="000000"/>
-          <w:sz w:val="24"/>
-        </w:rPr>
-        <w:t>d maps, time-series zoom, annual aggregation and CSV export. The revised validation panel separates emulator verification, matched-compartment GLDAS comparison, historical-human model agreement and well-head consistency. Source and interpretation notes are</w:t>
-      </w:r>
-      <w:r>
-        <w:rPr>
-          <w:rFonts w:ascii="Times New Roman" w:hAnsi="Times New Roman"/>
-          <w:color w:val="000000"/>
-          <w:sz w:val="24"/>
-        </w:rPr>
-        <w:t xml:space="preserve"> accessible beside the results.</w:t>
+        <w:t>The decision-support system is a static, publicly hosted GitHub Pages application using Leaflet and ECharts. It presents the 22 principal basins plus national context, storage selection, trend maps, time-series zoom, annual aggregation and CSV export. The revised validation panel separates emulator verification, matched-compartment GLDAS comparison, historical-human model agreement and well-head consistency. Source and interpretation notes are accessible beside the results.</w:t>
       </w:r>
     </w:p>
     <w:p>
@@ -5109,15 +4441,7 @@
           <w:color w:val="000000"/>
           <w:sz w:val="24"/>
         </w:rPr>
-        <w:t>Scientific checks verify groundwater-balance identities, the residual decomposition, common-date linear trend additivity, target/region counts and preservation of missing observations. Browser checks exercise basin selection</w:t>
-      </w:r>
-      <w:r>
-        <w:rPr>
-          <w:rFonts w:ascii="Times New Roman" w:hAnsi="Times New Roman"/>
-          <w:color w:val="000000"/>
-          <w:sz w:val="24"/>
-        </w:rPr>
-        <w:t>, all three views, storage controls and download rows on desktop and mobile. A working interface does not establish that an attribution hypothesis is true. Its contribution is to make both the evidence and its weaknesses reviewable.</w:t>
+        <w:t>Scientific checks verify groundwater-balance identities, the residual decomposition, common-date linear trend additivity, target/region counts and preservation of missing observations. Browser checks exercise basin selection, all three views, storage controls and download rows on desktop and mobile. A working interface does not establish that an attribution hypothesis is true. Its contribution is to make both the evidence and its weaknesses reviewable.</w:t>
       </w:r>
     </w:p>
     <w:p>
@@ -5134,7 +4458,7 @@
         </w:numPr>
         <w:spacing w:after="480"/>
       </w:pPr>
-      <w:bookmarkStart w:id="22" w:name="_Toc243747315"/>
+      <w:bookmarkStart w:id="22" w:name="_Toc243756243"/>
       <w:r>
         <w:rPr>
           <w:color w:val="000000"/>
@@ -5147,13 +4471,7 @@
           <w:color w:val="000000"/>
         </w:rPr>
         <w:br/>
-        <w:t>RESULTS AND</w:t>
-      </w:r>
-      <w:r>
-        <w:rPr>
-          <w:color w:val="000000"/>
-        </w:rPr>
-        <w:t xml:space="preserve"> DISCUSSION</w:t>
+        <w:t>RESULTS AND DISCUSSION</w:t>
       </w:r>
       <w:bookmarkEnd w:id="22"/>
     </w:p>
@@ -5166,7 +4484,7 @@
         </w:numPr>
         <w:spacing w:after="160"/>
       </w:pPr>
-      <w:bookmarkStart w:id="23" w:name="_Toc243747316"/>
+      <w:bookmarkStart w:id="23" w:name="_Toc243756244"/>
       <w:r>
         <w:rPr>
           <w:color w:val="000000"/>
@@ -5186,15 +4504,7 @@
           <w:color w:val="000000"/>
           <w:sz w:val="24"/>
         </w:rPr>
-        <w:t>All 22 basins have TWSA and GWSA seasonal trend estimates in the supplied dataset. National full-record TWSA declines at −7.46 mm/year, with a 300-resample interval of −9.60 to −5.69 mm/year. GWSA declines a</w:t>
-      </w:r>
-      <w:r>
-        <w:rPr>
-          <w:rFonts w:ascii="Times New Roman" w:hAnsi="Times New Roman"/>
-          <w:color w:val="000000"/>
-          <w:sz w:val="24"/>
-        </w:rPr>
-        <w:t>t −6.82 mm/year, with an interval of −8.64 to −5.13 mm/year. The records contain 235 and 223 observed monthly values, respectively, and the GWSA period is shorter.</w:t>
+        <w:t>All 22 basins have TWSA and GWSA seasonal trend estimates in the supplied dataset. National full-record TWSA declines at −7.46 mm/year, with a 300-resample interval of −9.60 to −5.69 mm/year. GWSA declines at −6.82 mm/year, with an interval of −8.64 to −5.13 mm/year. The records contain 235 and 223 observed monthly values, respectively, and the GWSA period is shorter.</w:t>
       </w:r>
     </w:p>
     <w:p>
@@ -5208,23 +4518,7 @@
           <w:color w:val="000000"/>
           <w:sz w:val="24"/>
         </w:rPr>
-        <w:t>The strongest negative slopes occur in several coastal southern basins, where leakage and co</w:t>
-      </w:r>
-      <w:r>
-        <w:rPr>
-          <w:rFonts w:ascii="Times New Roman" w:hAnsi="Times New Roman"/>
-          <w:color w:val="000000"/>
-          <w:sz w:val="24"/>
-        </w:rPr>
-        <w:t>mpartment/support differences deserve particular attention. Statistical significance cannot resolve these spatial-processing uncertainties. The filtered-soil GWSA sensitivity gives a national slope of −7.79 mm/year, whereas the related G3P groundwater prod</w:t>
-      </w:r>
-      <w:r>
-        <w:rPr>
-          <w:rFonts w:ascii="Times New Roman" w:hAnsi="Times New Roman"/>
-          <w:color w:val="000000"/>
-          <w:sz w:val="24"/>
-        </w:rPr>
-        <w:t>uct gives −3.45 mm/year. The direction is consistent nationally across those estimates, but the magnitude is clearly product dependent.</w:t>
+        <w:t>The strongest negative slopes occur in several coastal southern basins, where leakage and compartment/support differences deserve particular attention. Statistical significance cannot resolve these spatial-processing uncertainties. The filtered-soil GWSA sensitivity gives a national slope of −7.79 mm/year, whereas the related G3P groundwater product gives −3.45 mm/year. The direction is consistent nationally across those estimates, but the magnitude is clearly product dependent.</w:t>
       </w:r>
     </w:p>
     <w:p>
@@ -5444,15 +4738,7 @@
                 <w:color w:val="000000"/>
                 <w:sz w:val="21"/>
               </w:rPr>
-              <w:t>−</w:t>
-            </w:r>
-            <w:r>
-              <w:rPr>
-                <w:rFonts w:ascii="Times New Roman" w:hAnsi="Times New Roman"/>
-                <w:color w:val="000000"/>
-                <w:sz w:val="21"/>
-              </w:rPr>
-              <w:t>7.46</w:t>
+              <w:t>−7.46</w:t>
             </w:r>
           </w:p>
         </w:tc>
@@ -5478,15 +4764,7 @@
                 <w:color w:val="000000"/>
                 <w:sz w:val="21"/>
               </w:rPr>
-              <w:t>−</w:t>
-            </w:r>
-            <w:r>
-              <w:rPr>
-                <w:rFonts w:ascii="Times New Roman" w:hAnsi="Times New Roman"/>
-                <w:color w:val="000000"/>
-                <w:sz w:val="21"/>
-              </w:rPr>
-              <w:t>9.60 to −5.69</w:t>
+              <w:t>−9.60 to −5.69</w:t>
             </w:r>
           </w:p>
         </w:tc>
@@ -5562,15 +4840,7 @@
                 <w:color w:val="000000"/>
                 <w:sz w:val="21"/>
               </w:rPr>
-              <w:t>−</w:t>
-            </w:r>
-            <w:r>
-              <w:rPr>
-                <w:rFonts w:ascii="Times New Roman" w:hAnsi="Times New Roman"/>
-                <w:color w:val="000000"/>
-                <w:sz w:val="21"/>
-              </w:rPr>
-              <w:t>6.82</w:t>
+              <w:t>−6.82</w:t>
             </w:r>
           </w:p>
         </w:tc>
@@ -5595,15 +4865,7 @@
                 <w:color w:val="000000"/>
                 <w:sz w:val="21"/>
               </w:rPr>
-              <w:t>−</w:t>
-            </w:r>
-            <w:r>
-              <w:rPr>
-                <w:rFonts w:ascii="Times New Roman" w:hAnsi="Times New Roman"/>
-                <w:color w:val="000000"/>
-                <w:sz w:val="21"/>
-              </w:rPr>
-              <w:t>8.64 to −5.13</w:t>
+              <w:t>−8.64 to −5.13</w:t>
             </w:r>
           </w:p>
         </w:tc>
@@ -5618,7 +4880,7 @@
         </w:numPr>
         <w:spacing w:after="160"/>
       </w:pPr>
-      <w:bookmarkStart w:id="25" w:name="_Toc243747317"/>
+      <w:bookmarkStart w:id="25" w:name="_Toc243756245"/>
       <w:r>
         <w:rPr>
           <w:color w:val="000000"/>
@@ -5638,15 +4900,7 @@
           <w:color w:val="000000"/>
           <w:sz w:val="24"/>
         </w:rPr>
-        <w:t xml:space="preserve">The revised national emulator achieves test NSE 0.981, r 0.991 and RMSE 13.45 mm for naturalized TWSA, using 96 test months. For naturalized GWSA, NSE is 0.961, r </w:t>
-      </w:r>
-      <w:r>
-        <w:rPr>
-          <w:rFonts w:ascii="Times New Roman" w:hAnsi="Times New Roman"/>
-          <w:color w:val="000000"/>
-          <w:sz w:val="24"/>
-        </w:rPr>
-        <w:t>0.982 and RMSE 5.42 mm. Deseasonalized NSE remains positive at 0.888 and 0.781, respectively. This addresses the earlier weakness of evaluating success mainly through the seasonal cycle.</w:t>
+        <w:t>The revised national emulator achieves test NSE 0.981, r 0.991 and RMSE 13.45 mm for naturalized TWSA, using 96 test months. For naturalized GWSA, NSE is 0.961, r 0.982 and RMSE 5.42 mm. Deseasonalized NSE remains positive at 0.888 and 0.781, respectively. This addresses the earlier weakness of evaluating success mainly through the seasonal cycle.</w:t>
       </w:r>
     </w:p>
     <w:p>
@@ -5660,23 +4914,7 @@
           <w:color w:val="000000"/>
           <w:sz w:val="24"/>
         </w:rPr>
-        <w:t>Across the 22 basins, TWSA emulator NSE ranges from 0.928 to 0.983 an</w:t>
-      </w:r>
-      <w:r>
-        <w:rPr>
-          <w:rFonts w:ascii="Times New Roman" w:hAnsi="Times New Roman"/>
-          <w:color w:val="000000"/>
-          <w:sz w:val="24"/>
-        </w:rPr>
-        <w:t xml:space="preserve">d GWSA NSE from 0.892 to 0.970. Deseasonalized NSE ranges from 0.705 to 0.911 for TWSA and from 0.360 to 0.901 for GWSA. Those results show that meteorological memory captures much of the parent model's variability. They do not demonstrate that the parent </w:t>
-      </w:r>
-      <w:r>
-        <w:rPr>
-          <w:rFonts w:ascii="Times New Roman" w:hAnsi="Times New Roman"/>
-          <w:color w:val="000000"/>
-          <w:sz w:val="24"/>
-        </w:rPr>
-        <w:t>model's naturalized storage is the true unobserved counterfactual.</w:t>
+        <w:t>Across the 22 basins, TWSA emulator NSE ranges from 0.928 to 0.983 and GWSA NSE from 0.892 to 0.970. Deseasonalized NSE ranges from 0.705 to 0.911 for TWSA and from 0.360 to 0.901 for GWSA. Those results show that meteorological memory captures much of the parent model's variability. They do not demonstrate that the parent model's naturalized storage is the true unobserved counterfactual.</w:t>
       </w:r>
     </w:p>
     <w:p>
@@ -6091,16 +5329,7 @@
           <w:color w:val="000000"/>
           <w:sz w:val="24"/>
         </w:rPr>
-        <w:t xml:space="preserve">Figure 4.1 Climate emulator </w:t>
-      </w:r>
-      <w:r>
-        <w:rPr>
-          <w:rFonts w:ascii="Times New Roman" w:hAnsi="Times New Roman"/>
-          <w:b/>
-          <w:color w:val="000000"/>
-          <w:sz w:val="24"/>
-        </w:rPr>
-        <w:t>verification for 2016 to 2023</w:t>
+        <w:t>Figure 4.1 Climate emulator verification for 2016 to 2023</w:t>
       </w:r>
       <w:bookmarkEnd w:id="27"/>
     </w:p>
@@ -6113,7 +5342,7 @@
         </w:numPr>
         <w:spacing w:after="160"/>
       </w:pPr>
-      <w:bookmarkStart w:id="28" w:name="_Toc243747318"/>
+      <w:bookmarkStart w:id="28" w:name="_Toc243756246"/>
       <w:r>
         <w:rPr>
           <w:color w:val="000000"/>
@@ -6133,23 +5362,7 @@
           <w:color w:val="000000"/>
           <w:sz w:val="24"/>
         </w:rPr>
-        <w:t>The naturalized WaterGAP land-compartment benchmark against GLDAS Noah gives national NSE 0.738 and r 0.969. Agreement is higher than for groundwater because Noah does not supply a groundwater targe</w:t>
-      </w:r>
-      <w:r>
-        <w:rPr>
-          <w:rFonts w:ascii="Times New Roman" w:hAnsi="Times New Roman"/>
-          <w:color w:val="000000"/>
-          <w:sz w:val="24"/>
-        </w:rPr>
-        <w:t>t and the models represent different subsurface storage. Against observed TWSA, the historical-human WaterGAP run gives NSE 0.673 and r 0.873, compared with 0.652 and 0.862 for the naturalized run. This is a modest improvement in observation consistency ra</w:t>
-      </w:r>
-      <w:r>
-        <w:rPr>
-          <w:rFonts w:ascii="Times New Roman" w:hAnsi="Times New Roman"/>
-          <w:color w:val="000000"/>
-          <w:sz w:val="24"/>
-        </w:rPr>
-        <w:t>ther than independent validation of water-use quantities.</w:t>
+        <w:t>The naturalized WaterGAP land-compartment benchmark against GLDAS Noah gives national NSE 0.738 and r 0.969. Agreement is higher than for groundwater because Noah does not supply a groundwater target and the models represent different subsurface storage. Against observed TWSA, the historical-human WaterGAP run gives NSE 0.673 and r 0.873, compared with 0.652 and 0.862 for the naturalized run. This is a modest improvement in observation consistency rather than independent validation of water-use quantities.</w:t>
       </w:r>
     </w:p>
     <w:p>
@@ -6163,23 +5376,7 @@
           <w:color w:val="000000"/>
           <w:sz w:val="24"/>
         </w:rPr>
-        <w:t>For GWSA, naturalized-model observation NSE is only 0.110, and the historical-human run gives 0.093. Thus adding the modeled human effects does not improve national groundwater agreement in this com</w:t>
-      </w:r>
-      <w:r>
-        <w:rPr>
-          <w:rFonts w:ascii="Times New Roman" w:hAnsi="Times New Roman"/>
-          <w:color w:val="000000"/>
-          <w:sz w:val="24"/>
-        </w:rPr>
-        <w:t>parison. The results separate strong statistical emulation from weaker hydrological realism. The original GRACE-trained model's test NSE of −0.401 for GWSA is retained as a different empirical experiment, not compared as if its evaluation target were ident</w:t>
-      </w:r>
-      <w:r>
-        <w:rPr>
-          <w:rFonts w:ascii="Times New Roman" w:hAnsi="Times New Roman"/>
-          <w:color w:val="000000"/>
-          <w:sz w:val="24"/>
-        </w:rPr>
-        <w:t>ical.</w:t>
+        <w:t>For GWSA, naturalized-model observation NSE is only 0.110, and the historical-human run gives 0.093. Thus adding the modeled human effects does not improve national groundwater agreement in this comparison. The results separate strong statistical emulation from weaker hydrological realism. The original GRACE-trained model's test NSE of −0.401 for GWSA is retained as a different empirical experiment, not compared as if its evaluation target were identical.</w:t>
       </w:r>
     </w:p>
     <w:p>
@@ -6257,7 +5454,7 @@
         </w:numPr>
         <w:spacing w:after="160"/>
       </w:pPr>
-      <w:bookmarkStart w:id="30" w:name="_Toc243747319"/>
+      <w:bookmarkStart w:id="30" w:name="_Toc243756247"/>
       <w:r>
         <w:rPr>
           <w:color w:val="000000"/>
@@ -6277,23 +5474,7 @@
           <w:color w:val="000000"/>
           <w:sz w:val="24"/>
         </w:rPr>
-        <w:t xml:space="preserve">On the common observed-model record, the national naturalized climate Sen slope is −0.25 mm/year for TWSA and −0.05 mm/year for GWSA. The </w:t>
-      </w:r>
-      <w:r>
-        <w:rPr>
-          <w:rFonts w:ascii="Times New Roman" w:hAnsi="Times New Roman"/>
-          <w:color w:val="000000"/>
-          <w:sz w:val="24"/>
-        </w:rPr>
-        <w:t>observed residual slopes are −6.61 and −6.55 mm/year. However, the paired modeled-human slopes are only −0.52 mm/year for TWSA and +0.04 mm/year for GWSA. Substantial observation–model discrepancy therefore remains after the model's direct human effects ar</w:t>
-      </w:r>
-      <w:r>
-        <w:rPr>
-          <w:rFonts w:ascii="Times New Roman" w:hAnsi="Times New Roman"/>
-          <w:color w:val="000000"/>
-          <w:sz w:val="24"/>
-        </w:rPr>
-        <w:t>e included.</w:t>
+        <w:t>On the common observed-model record, the national naturalized climate Sen slope is −0.25 mm/year for TWSA and −0.05 mm/year for GWSA. The observed residual slopes are −6.61 and −6.55 mm/year. However, the paired modeled-human slopes are only −0.52 mm/year for TWSA and +0.04 mm/year for GWSA. Substantial observation–model discrepancy therefore remains after the model's direct human effects are included.</w:t>
       </w:r>
     </w:p>
     <w:p>
@@ -6307,23 +5488,7 @@
           <w:color w:val="000000"/>
           <w:sz w:val="24"/>
         </w:rPr>
-        <w:t>This result is incompatible with naming every residual unit a validated human contribution. It could reflect unrepresented abstraction, inadequate groundwater dynamics, forcing error, compartment/filtering mismatch, problems in the supplied gra</w:t>
-      </w:r>
-      <w:r>
-        <w:rPr>
-          <w:rFonts w:ascii="Times New Roman" w:hAnsi="Times New Roman"/>
-          <w:color w:val="000000"/>
-          <w:sz w:val="24"/>
-        </w:rPr>
-        <w:t>vimetry or several mechanisms together. The analysis cannot discriminate those explanations quantitatively with the available observations. Component Sen slopes are shown as separate robust summaries, with an additive fixed-month OLS partition provided sep</w:t>
-      </w:r>
-      <w:r>
-        <w:rPr>
-          <w:rFonts w:ascii="Times New Roman" w:hAnsi="Times New Roman"/>
-          <w:color w:val="000000"/>
-          <w:sz w:val="24"/>
-        </w:rPr>
-        <w:t>arately.</w:t>
+        <w:t>This result is incompatible with naming every residual unit a validated human contribution. It could reflect unrepresented abstraction, inadequate groundwater dynamics, forcing error, compartment/filtering mismatch, problems in the supplied gravimetry or several mechanisms together. The analysis cannot discriminate those explanations quantitatively with the available observations. Component Sen slopes are shown as separate robust summaries, with an additive fixed-month OLS partition provided separately.</w:t>
       </w:r>
     </w:p>
     <w:p>
@@ -6910,16 +6075,7 @@
           <w:color w:val="000000"/>
           <w:sz w:val="24"/>
         </w:rPr>
-        <w:t>Figure 4.3 Residual and modeled human effect with rema</w:t>
-      </w:r>
-      <w:r>
-        <w:rPr>
-          <w:rFonts w:ascii="Times New Roman" w:hAnsi="Times New Roman"/>
-          <w:b/>
-          <w:color w:val="000000"/>
-          <w:sz w:val="24"/>
-        </w:rPr>
-        <w:t>ining discrepancy</w:t>
+        <w:t>Figure 4.3 Residual and modeled human effect with remaining discrepancy</w:t>
       </w:r>
       <w:bookmarkEnd w:id="32"/>
     </w:p>
@@ -6998,7 +6154,7 @@
         </w:numPr>
         <w:spacing w:after="160"/>
       </w:pPr>
-      <w:bookmarkStart w:id="34" w:name="_Toc243747320"/>
+      <w:bookmarkStart w:id="34" w:name="_Toc243756248"/>
       <w:r>
         <w:rPr>
           <w:color w:val="000000"/>
@@ -7018,15 +6174,7 @@
           <w:color w:val="000000"/>
           <w:sz w:val="24"/>
         </w:rPr>
-        <w:t>National annual TWSA-residual agreement with the head index is r = 0.142 over 18 years; for GWSA it is r = 0.054 over 17 years. Contr</w:t>
-      </w:r>
-      <w:r>
-        <w:rPr>
-          <w:rFonts w:ascii="Times New Roman" w:hAnsi="Times New Roman"/>
-          <w:color w:val="000000"/>
-          <w:sz w:val="24"/>
-        </w:rPr>
-        <w:t>olling naturalized climate gives partial correlations of 0.131 and 0.029. Detrended associations are −0.023 and −0.082. These weak results do not confirm the human-depletion interpretation of the residual.</w:t>
+        <w:t>National annual TWSA-residual agreement with the head index is r = 0.142 over 18 years; for GWSA it is r = 0.054 over 17 years. Controlling naturalized climate gives partial correlations of 0.131 and 0.029. Detrended associations are −0.023 and −0.082. These weak results do not confirm the human-depletion interpretation of the residual.</w:t>
       </w:r>
     </w:p>
     <w:p>
@@ -7040,7 +6188,7 @@
           <w:color w:val="000000"/>
           <w:sz w:val="24"/>
         </w:rPr>
-        <w:t>The result is informative even though it is not th</w:t>
+        <w:t xml:space="preserve">The result is informative even though it is not the desired strong validation. It prevents high emulator NSE or a declining gravimetric record from being mistaken for independent </w:t>
       </w:r>
       <w:r>
         <w:rPr>
@@ -7048,24 +6196,8 @@
           <w:color w:val="000000"/>
           <w:sz w:val="24"/>
         </w:rPr>
-        <w:t xml:space="preserve">e desired strong validation. It prevents high emulator NSE or a declining gravimetric record from being mistaken for independent </w:t>
-      </w:r>
-      <w:r>
-        <w:rPr>
-          <w:rFonts w:ascii="Times New Roman" w:hAnsi="Times New Roman"/>
-          <w:color w:val="000000"/>
-          <w:sz w:val="24"/>
-        </w:rPr>
         <w:lastRenderedPageBreak/>
-        <w:t>confirmation of human groundwater loss. Basin results and flag/panel sensitivities are retained, including insufficient-support</w:t>
-      </w:r>
-      <w:r>
-        <w:rPr>
-          <w:rFonts w:ascii="Times New Roman" w:hAnsi="Times New Roman"/>
-          <w:color w:val="000000"/>
-          <w:sz w:val="24"/>
-        </w:rPr>
-        <w:t xml:space="preserve"> cases rather than fabricated correlations. Head observations are affected by sparse seasonal sampling, changing station availability, mixed aquifers and a point-to-basin scale mismatch.</w:t>
+        <w:t>confirmation of human groundwater loss. Basin results and flag/panel sensitivities are retained, including insufficient-support cases rather than fabricated correlations. Head observations are affected by sparse seasonal sampling, changing station availability, mixed aquifers and a point-to-basin scale mismatch.</w:t>
       </w:r>
     </w:p>
     <w:p>
@@ -7083,16 +6215,7 @@
           <w:color w:val="000000"/>
           <w:sz w:val="24"/>
         </w:rPr>
-        <w:t xml:space="preserve">Table 4.4 Annual residual association with observed </w:t>
-      </w:r>
-      <w:r>
-        <w:rPr>
-          <w:rFonts w:ascii="Times New Roman" w:hAnsi="Times New Roman"/>
-          <w:b/>
-          <w:color w:val="000000"/>
-          <w:sz w:val="24"/>
-        </w:rPr>
-        <w:t>groundwater head</w:t>
+        <w:t>Table 4.4 Annual residual association with observed groundwater head</w:t>
       </w:r>
       <w:bookmarkEnd w:id="35"/>
     </w:p>
@@ -7501,7 +6624,7 @@
         </w:numPr>
         <w:spacing w:after="160"/>
       </w:pPr>
-      <w:bookmarkStart w:id="37" w:name="_Toc243747321"/>
+      <w:bookmarkStart w:id="37" w:name="_Toc243756249"/>
       <w:r>
         <w:rPr>
           <w:color w:val="000000"/>
@@ -7521,23 +6644,7 @@
           <w:color w:val="000000"/>
           <w:sz w:val="24"/>
         </w:rPr>
-        <w:t xml:space="preserve">The methodological improvement is the explicit separation of </w:t>
-      </w:r>
-      <w:r>
-        <w:rPr>
-          <w:rFonts w:ascii="Times New Roman" w:hAnsi="Times New Roman"/>
-          <w:color w:val="000000"/>
-          <w:sz w:val="24"/>
-        </w:rPr>
-        <w:t>three evaluation questions: whether an emulator reproduces a model, whether a hydrological model agrees with observed storage, and whether independent heads support the residual interpretation. Strong performance in the first question cannot answer the oth</w:t>
-      </w:r>
-      <w:r>
-        <w:rPr>
-          <w:rFonts w:ascii="Times New Roman" w:hAnsi="Times New Roman"/>
-          <w:color w:val="000000"/>
-          <w:sz w:val="24"/>
-        </w:rPr>
-        <w:t>er two. The revised workflow makes that distinction numerically visible. In particular, national GWSA emulator skill exceeds 0.96 while the historical-human model's observation NSE is only about 0.09.</w:t>
+        <w:t>The methodological improvement is the explicit separation of three evaluation questions: whether an emulator reproduces a model, whether a hydrological model agrees with observed storage, and whether independent heads support the residual interpretation. Strong performance in the first question cannot answer the other two. The revised workflow makes that distinction numerically visible. In particular, national GWSA emulator skill exceeds 0.96 while the historical-human model's observation NSE is only about 0.09.</w:t>
       </w:r>
     </w:p>
     <w:p>
@@ -7551,23 +6658,7 @@
           <w:color w:val="000000"/>
           <w:sz w:val="24"/>
         </w:rPr>
-        <w:t>The difference between the observed residual and the pa</w:t>
-      </w:r>
-      <w:r>
-        <w:rPr>
-          <w:rFonts w:ascii="Times New Roman" w:hAnsi="Times New Roman"/>
-          <w:color w:val="000000"/>
-          <w:sz w:val="24"/>
-        </w:rPr>
-        <w:t>ired modeled-human effect is scientifically important. It shows that the attribution is structurally underdetermined, rather than simply providing an uncertain estimate of a known pumping signal. Naturalized-model error should be retained in the discrepanc</w:t>
-      </w:r>
-      <w:r>
-        <w:rPr>
-          <w:rFonts w:ascii="Times New Roman" w:hAnsi="Times New Roman"/>
-          <w:color w:val="000000"/>
-          <w:sz w:val="24"/>
-        </w:rPr>
-        <w:t xml:space="preserve">y term instead of allocated to human water use. The </w:t>
+        <w:t xml:space="preserve">The difference between the observed residual and the paired modeled-human effect is scientifically important. It shows that the attribution is structurally underdetermined, rather than simply providing an uncertain estimate of a known pumping signal. Naturalized-model error should be retained in the discrepancy term instead of allocated to human water use. The </w:t>
       </w:r>
       <w:r>
         <w:rPr>
@@ -7590,23 +6681,7 @@
           <w:color w:val="000000"/>
           <w:sz w:val="24"/>
         </w:rPr>
-        <w:t>Residual correlation with observed head is not a direct tes</w:t>
-      </w:r>
-      <w:r>
-        <w:rPr>
-          <w:rFonts w:ascii="Times New Roman" w:hAnsi="Times New Roman"/>
-          <w:color w:val="000000"/>
-          <w:sz w:val="24"/>
-        </w:rPr>
-        <w:t>t of a purely human head component. Both variables can contain climate variability, broad trends and measurement error. Partial, detrended and consecutive-change checks reduce some confounding but cannot replace aquifer-specific observations or pumping rec</w:t>
-      </w:r>
-      <w:r>
-        <w:rPr>
-          <w:rFonts w:ascii="Times New Roman" w:hAnsi="Times New Roman"/>
-          <w:color w:val="000000"/>
-          <w:sz w:val="24"/>
-        </w:rPr>
-        <w:t>ords. Their weak national values here support cautious interpretation even when a few basin-level correlations appear stronger.</w:t>
+        <w:t>Residual correlation with observed head is not a direct test of a purely human head component. Both variables can contain climate variability, broad trends and measurement error. Partial, detrended and consecutive-change checks reduce some confounding but cannot replace aquifer-specific observations or pumping records. Their weak national values here support cautious interpretation even when a few basin-level correlations appear stronger.</w:t>
       </w:r>
     </w:p>
     <w:p>
@@ -7618,7 +6693,7 @@
         </w:numPr>
         <w:spacing w:after="160"/>
       </w:pPr>
-      <w:bookmarkStart w:id="38" w:name="_Toc243747322"/>
+      <w:bookmarkStart w:id="38" w:name="_Toc243756250"/>
       <w:r>
         <w:rPr>
           <w:color w:val="000000"/>
@@ -7638,23 +6713,7 @@
           <w:color w:val="000000"/>
           <w:sz w:val="24"/>
         </w:rPr>
-        <w:t>Several limitations matter before journal submission or management use. The original GRACE proce</w:t>
-      </w:r>
-      <w:r>
-        <w:rPr>
-          <w:rFonts w:ascii="Times New Roman" w:hAnsi="Times New Roman"/>
-          <w:color w:val="000000"/>
-          <w:sz w:val="24"/>
-        </w:rPr>
-        <w:t>ssing centre and release must be recovered, and sensitivity to a second identified gravimetric solution should be quantified. Model-cell replication does not correct leakage, and neighboring small basins are not independent. The primary counterfactual is a</w:t>
-      </w:r>
-      <w:r>
-        <w:rPr>
-          <w:rFonts w:ascii="Times New Roman" w:hAnsi="Times New Roman"/>
-          <w:color w:val="000000"/>
-          <w:sz w:val="24"/>
-        </w:rPr>
-        <w:t xml:space="preserve"> single hydrological-model/forcing combination, so emulator spread is not total counterfactual uncertainty.</w:t>
+        <w:t>Several limitations matter before journal submission or management use. The original GRACE processing centre and release must be recovered, and sensitivity to a second identified gravimetric solution should be quantified. Model-cell replication does not correct leakage, and neighboring small basins are not independent. The primary counterfactual is a single hydrological-model/forcing combination, so emulator spread is not total counterfactual uncertainty.</w:t>
       </w:r>
     </w:p>
     <w:p>
@@ -7668,23 +6727,7 @@
           <w:color w:val="000000"/>
           <w:sz w:val="24"/>
         </w:rPr>
-        <w:t>WaterGAP and GLDAS represent different soil and aquifer systems, while GWSA subtraction combines sources with different filtering. The groundwater o</w:t>
-      </w:r>
-      <w:r>
-        <w:rPr>
-          <w:rFonts w:ascii="Times New Roman" w:hAnsi="Times New Roman"/>
-          <w:color w:val="000000"/>
-          <w:sz w:val="24"/>
-        </w:rPr>
-        <w:t>bservations lack aquifer identities and storage coefficients and are predominantly annual, often based on two readings. Fixed-eligibility panels still vary in annual availability. Finally, updated climate attribution ends in 2023 rather than inventing a mo</w:t>
-      </w:r>
-      <w:r>
-        <w:rPr>
-          <w:rFonts w:ascii="Times New Roman" w:hAnsi="Times New Roman"/>
-          <w:color w:val="000000"/>
-          <w:sz w:val="24"/>
-        </w:rPr>
-        <w:t>del extension to match the final 2024 TWSA observations.</w:t>
+        <w:t>WaterGAP and GLDAS represent different soil and aquifer systems, while GWSA subtraction combines sources with different filtering. The groundwater observations lack aquifer identities and storage coefficients and are predominantly annual, often based on two readings. Fixed-eligibility panels still vary in annual availability. Finally, updated climate attribution ends in 2023 rather than inventing a model extension to match the final 2024 TWSA observations.</w:t>
       </w:r>
     </w:p>
     <w:p>
@@ -7696,7 +6739,7 @@
         </w:numPr>
         <w:spacing w:after="160"/>
       </w:pPr>
-      <w:bookmarkStart w:id="39" w:name="_Toc243747323"/>
+      <w:bookmarkStart w:id="39" w:name="_Toc243756251"/>
       <w:r>
         <w:rPr>
           <w:color w:val="000000"/>
@@ -7716,23 +6759,7 @@
           <w:color w:val="000000"/>
           <w:sz w:val="24"/>
         </w:rPr>
-        <w:t xml:space="preserve">The application presents all 22 basins and national context, with both storage types, interactive maps and time-series controls. The revised panel separates emulator </w:t>
-      </w:r>
-      <w:r>
-        <w:rPr>
-          <w:rFonts w:ascii="Times New Roman" w:hAnsi="Times New Roman"/>
-          <w:color w:val="000000"/>
-          <w:sz w:val="24"/>
-        </w:rPr>
-        <w:t>verification, matched-compartment GLDAS benchmarking and groundwater consistency. Browser checks passed for desktop and mobile interaction and CSV export. The public site at https://pratikkhanal16.github.io/thailand-water-storage-dss/ retains weak validati</w:t>
-      </w:r>
-      <w:r>
-        <w:rPr>
-          <w:rFonts w:ascii="Times New Roman" w:hAnsi="Times New Roman"/>
-          <w:color w:val="000000"/>
-          <w:sz w:val="24"/>
-        </w:rPr>
-        <w:t>on results alongside downloadable basin evidence.</w:t>
+        <w:t>The application presents all 22 basins and national context, with both storage types, interactive maps and time-series controls. The revised panel separates emulator verification, matched-compartment GLDAS benchmarking and groundwater consistency. Browser checks passed for desktop and mobile interaction and CSV export. The public site at https://pratikkhanal16.github.io/thailand-water-storage-dss/ retains weak validation results alongside downloadable basin evidence.</w:t>
       </w:r>
     </w:p>
     <w:p>
@@ -7749,7 +6776,7 @@
         </w:numPr>
         <w:spacing w:after="480"/>
       </w:pPr>
-      <w:bookmarkStart w:id="40" w:name="_Toc243747324"/>
+      <w:bookmarkStart w:id="40" w:name="_Toc243756252"/>
       <w:r>
         <w:rPr>
           <w:color w:val="000000"/>
@@ -7775,7 +6802,7 @@
         </w:numPr>
         <w:spacing w:after="160"/>
       </w:pPr>
-      <w:bookmarkStart w:id="41" w:name="_Toc243747325"/>
+      <w:bookmarkStart w:id="41" w:name="_Toc243756253"/>
       <w:r>
         <w:rPr>
           <w:color w:val="000000"/>
@@ -7795,23 +6822,7 @@
           <w:color w:val="000000"/>
           <w:sz w:val="24"/>
         </w:rPr>
-        <w:t xml:space="preserve">Objective 1 was completed with basin and grid TWSA/GWSA trends, statistical tests, uncertainty and source sensitivities. Objective 2 was </w:t>
-      </w:r>
-      <w:r>
-        <w:rPr>
-          <w:rFonts w:ascii="Times New Roman" w:hAnsi="Times New Roman"/>
-          <w:color w:val="000000"/>
-          <w:sz w:val="24"/>
-        </w:rPr>
-        <w:t>strengthened by naturalized-target climate emulation, chronological verification, matched-compartment GLDAS benchmarking, a paired human-impact experiment and actual-head consistency checks. Objective 3 was completed as an interactive, hosted application w</w:t>
-      </w:r>
-      <w:r>
-        <w:rPr>
-          <w:rFonts w:ascii="Times New Roman" w:hAnsi="Times New Roman"/>
-          <w:color w:val="000000"/>
-          <w:sz w:val="24"/>
-        </w:rPr>
-        <w:t>ith downloadable results. Completion describes the analyses and deliverables, not proof of a predetermined attribution hypothesis.</w:t>
+        <w:t>Objective 1 was completed with basin and grid TWSA/GWSA trends, statistical tests, uncertainty and source sensitivities. Objective 2 was strengthened by naturalized-target climate emulation, chronological verification, matched-compartment GLDAS benchmarking, a paired human-impact experiment and actual-head consistency checks. Objective 3 was completed as an interactive, hosted application with downloadable results. Completion describes the analyses and deliverables, not proof of a predetermined attribution hypothesis.</w:t>
       </w:r>
     </w:p>
     <w:p>
@@ -7825,23 +6836,7 @@
           <w:color w:val="000000"/>
           <w:sz w:val="24"/>
         </w:rPr>
-        <w:t>The supplied national storage records decline, and the naturalized-model emulators reproduce seasonal and interannual variabi</w:t>
-      </w:r>
-      <w:r>
-        <w:rPr>
-          <w:rFonts w:ascii="Times New Roman" w:hAnsi="Times New Roman"/>
-          <w:color w:val="000000"/>
-          <w:sz w:val="24"/>
-        </w:rPr>
-        <w:t>lity well. Independent groundwater consistency remains weak, and the paired human simulation leaves substantial unexplained storage discrepancy. The full residual must therefore remain an observation-informed candidate signal. It cannot be reported as a va</w:t>
-      </w:r>
-      <w:r>
-        <w:rPr>
-          <w:rFonts w:ascii="Times New Roman" w:hAnsi="Times New Roman"/>
-          <w:color w:val="000000"/>
-          <w:sz w:val="24"/>
-        </w:rPr>
-        <w:t>lidated human pumping volume or an exact human share of TWSA.</w:t>
+        <w:t>The supplied national storage records decline, and the naturalized-model emulators reproduce seasonal and interannual variability well. Independent groundwater consistency remains weak, and the paired human simulation leaves substantial unexplained storage discrepancy. The full residual must therefore remain an observation-informed candidate signal. It cannot be reported as a validated human pumping volume or an exact human share of TWSA.</w:t>
       </w:r>
     </w:p>
     <w:p>
@@ -7853,7 +6848,7 @@
         </w:numPr>
         <w:spacing w:after="160"/>
       </w:pPr>
-      <w:bookmarkStart w:id="42" w:name="_Toc243747326"/>
+      <w:bookmarkStart w:id="42" w:name="_Toc243756254"/>
       <w:r>
         <w:rPr>
           <w:color w:val="000000"/>
@@ -7873,23 +6868,7 @@
           <w:color w:val="000000"/>
           <w:sz w:val="24"/>
         </w:rPr>
-        <w:t xml:space="preserve">The next scientific priority is to establish original gravimetry provenance and harmonize model/observation filtering before adding model complexity. Monthly heads should be </w:t>
-      </w:r>
-      <w:r>
-        <w:rPr>
-          <w:rFonts w:ascii="Times New Roman" w:hAnsi="Times New Roman"/>
-          <w:color w:val="000000"/>
-          <w:sz w:val="24"/>
-        </w:rPr>
-        <w:t>grouped by aquifer, screened for representative sampling and linked to documented storage coefficients. Independent pumping and reservoir histories are needed to test timing and magnitude of human influences. Multiple naturalized hydrological models and fo</w:t>
-      </w:r>
-      <w:r>
-        <w:rPr>
-          <w:rFonts w:ascii="Times New Roman" w:hAnsi="Times New Roman"/>
-          <w:color w:val="000000"/>
-          <w:sz w:val="24"/>
-        </w:rPr>
-        <w:t>rcing realizations would then permit an uncertainty assessment broader than emulation error.</w:t>
+        <w:t>The next scientific priority is to establish original gravimetry provenance and harmonize model/observation filtering before adding model complexity. Monthly heads should be grouped by aquifer, screened for representative sampling and linked to documented storage coefficients. Independent pumping and reservoir histories are needed to test timing and magnitude of human influences. Multiple naturalized hydrological models and forcing realizations would then permit an uncertainty assessment broader than emulation error.</w:t>
       </w:r>
     </w:p>
     <w:p>
@@ -7903,23 +6882,7 @@
           <w:color w:val="000000"/>
           <w:sz w:val="24"/>
         </w:rPr>
-        <w:t>For present decision support, use the application to compare observed trends, inspect data coverage and identify basins needing investigation. Do not rank abstract</w:t>
-      </w:r>
-      <w:r>
-        <w:rPr>
-          <w:rFonts w:ascii="Times New Roman" w:hAnsi="Times New Roman"/>
-          <w:color w:val="000000"/>
-          <w:sz w:val="24"/>
-        </w:rPr>
-        <w:t>ion controls from the residual alone. Strong-looking seasonal scores should always be read beside anomaly skill and independent evidence. Advisor review should assess the source provenance and scale assumptions before the manuscript is submitted or the res</w:t>
-      </w:r>
-      <w:r>
-        <w:rPr>
-          <w:rFonts w:ascii="Times New Roman" w:hAnsi="Times New Roman"/>
-          <w:color w:val="000000"/>
-          <w:sz w:val="24"/>
-        </w:rPr>
-        <w:t>ults are used operationally.</w:t>
+        <w:t>For present decision support, use the application to compare observed trends, inspect data coverage and identify basins needing investigation. Do not rank abstraction controls from the residual alone. Strong-looking seasonal scores should always be read beside anomaly skill and independent evidence. Advisor review should assess the source provenance and scale assumptions before the manuscript is submitted or the results are used operationally.</w:t>
       </w:r>
     </w:p>
     <w:p>
@@ -7936,7 +6899,7 @@
         </w:numPr>
         <w:spacing w:after="480"/>
       </w:pPr>
-      <w:bookmarkStart w:id="43" w:name="_Toc243747327"/>
+      <w:bookmarkStart w:id="43" w:name="_Toc243756255"/>
       <w:r>
         <w:rPr>
           <w:color w:val="000000"/>
@@ -7971,23 +6934,7 @@
           <w:color w:val="000000"/>
           <w:sz w:val="24"/>
         </w:rPr>
-        <w:t>Bäthge, A., Ruz Vargas, C., Lischeid, G., C</w:t>
-      </w:r>
-      <w:r>
-        <w:rPr>
-          <w:rFonts w:ascii="Times New Roman" w:hAnsi="Times New Roman"/>
-          <w:color w:val="000000"/>
-          <w:sz w:val="24"/>
-        </w:rPr>
-        <w:t xml:space="preserve">ollenteur, R., Cuthbert, M., Fleckenstein, J. H., Floerke, M., De Graaf, I., Gnann, S., Hartmann, A., Huggins, X., Moosdorf, N., Wada, Y., Wagener, T., &amp; Reinecke, R. (2026). GROW A global-scale time series dataset for groundwater studies within the Earth </w:t>
-      </w:r>
-      <w:r>
-        <w:rPr>
-          <w:rFonts w:ascii="Times New Roman" w:hAnsi="Times New Roman"/>
-          <w:color w:val="000000"/>
-          <w:sz w:val="24"/>
-        </w:rPr>
-        <w:t>system [Data set]. Zenodo. https://doi.org/10.5281/zenodo.15149480</w:t>
+        <w:t>Bäthge, A., Ruz Vargas, C., Lischeid, G., Collenteur, R., Cuthbert, M., Fleckenstein, J. H., Floerke, M., De Graaf, I., Gnann, S., Hartmann, A., Huggins, X., Moosdorf, N., Wada, Y., Wagener, T., &amp; Reinecke, R. (2026). GROW A global-scale time series dataset for groundwater studies within the Earth system [Data set]. Zenodo. https://doi.org/10.5281/zenodo.15149480</w:t>
       </w:r>
     </w:p>
     <w:p>
@@ -8001,15 +6948,7 @@
           <w:color w:val="000000"/>
           <w:sz w:val="24"/>
         </w:rPr>
-        <w:t>Güntner, A., Sharifi, E., Haas, J., Boergens, E., Dahle, C., Dobslaw, H., Dorigo, W., Dussaillant, I., Flechtner, F., Jäggi, A., Kosmale, M., Luojus, K., Mayer-Gürr, T., Meyer, U., Preimesb</w:t>
-      </w:r>
-      <w:r>
-        <w:rPr>
-          <w:rFonts w:ascii="Times New Roman" w:hAnsi="Times New Roman"/>
-          <w:color w:val="000000"/>
-          <w:sz w:val="24"/>
-        </w:rPr>
-        <w:t>erger, W., Ruz Vargas, C., &amp; Zemp, M. (2024). Global Gravity-based Groundwater Product G3P version 1.12 [Data set]. GFZ Data Services. https://doi.org/10.5880/G3P.2024.001</w:t>
+        <w:t>Güntner, A., Sharifi, E., Haas, J., Boergens, E., Dahle, C., Dobslaw, H., Dorigo, W., Dussaillant, I., Flechtner, F., Jäggi, A., Kosmale, M., Luojus, K., Mayer-Gürr, T., Meyer, U., Preimesberger, W., Ruz Vargas, C., &amp; Zemp, M. (2024). Global Gravity-based Groundwater Product G3P version 1.12 [Data set]. GFZ Data Services. https://doi.org/10.5880/G3P.2024.001</w:t>
       </w:r>
     </w:p>
     <w:p>
@@ -8023,15 +6962,7 @@
           <w:color w:val="000000"/>
           <w:sz w:val="24"/>
         </w:rPr>
-        <w:t>Hirsch, R. M., Slack, J. R., &amp; Smith, R. A. (1982). Techniques of trend analysis for</w:t>
-      </w:r>
-      <w:r>
-        <w:rPr>
-          <w:rFonts w:ascii="Times New Roman" w:hAnsi="Times New Roman"/>
-          <w:color w:val="000000"/>
-          <w:sz w:val="24"/>
-        </w:rPr>
-        <w:t xml:space="preserve"> monthly water quality data. Water Resources Research, 18(1), 107–121. https://doi.org/10.1029/WR018i001p00107</w:t>
+        <w:t>Hirsch, R. M., Slack, J. R., &amp; Smith, R. A. (1982). Techniques of trend analysis for monthly water quality data. Water Resources Research, 18(1), 107–121. https://doi.org/10.1029/WR018i001p00107</w:t>
       </w:r>
     </w:p>
     <w:p>
@@ -8045,15 +6976,7 @@
           <w:color w:val="000000"/>
           <w:sz w:val="24"/>
         </w:rPr>
-        <w:t>Hirsch, R. M., &amp; Slack, J. R. (1984). A nonparametric trend test for seasonal data with serial dependence. Water Resources Research, 20(6), 727–7</w:t>
-      </w:r>
-      <w:r>
-        <w:rPr>
-          <w:rFonts w:ascii="Times New Roman" w:hAnsi="Times New Roman"/>
-          <w:color w:val="000000"/>
-          <w:sz w:val="24"/>
-        </w:rPr>
-        <w:t>32. https://doi.org/10.1029/WR020i006p00727</w:t>
+        <w:t>Hirsch, R. M., &amp; Slack, J. R. (1984). A nonparametric trend test for seasonal data with serial dependence. Water Resources Research, 20(6), 727–732. https://doi.org/10.1029/WR020i006p00727</w:t>
       </w:r>
     </w:p>
     <w:p>
@@ -8067,15 +6990,7 @@
           <w:color w:val="000000"/>
           <w:sz w:val="24"/>
         </w:rPr>
-        <w:t>Müller Schmied, H., Trautmann, T., Ackermann, S., Cáceres, D., Flörke, M., Gerdener, H., Kynast, E., Peiris, T. A., Schiebener, L., Schumacher, M., &amp; Döll, P. (2024). The global water resources and use model Wate</w:t>
-      </w:r>
-      <w:r>
-        <w:rPr>
-          <w:rFonts w:ascii="Times New Roman" w:hAnsi="Times New Roman"/>
-          <w:color w:val="000000"/>
-          <w:sz w:val="24"/>
-        </w:rPr>
-        <w:t>rGAP v2.2e Description and evaluation of modifications and new features. Geoscientific Model Development, 17, 8817–8852. https://doi.org/10.5194/gmd-17-8817-2024</w:t>
+        <w:t>Müller Schmied, H., Trautmann, T., Ackermann, S., Cáceres, D., Flörke, M., Gerdener, H., Kynast, E., Peiris, T. A., Schiebener, L., Schumacher, M., &amp; Döll, P. (2024). The global water resources and use model WaterGAP v2.2e Description and evaluation of modifications and new features. Geoscientific Model Development, 17, 8817–8852. https://doi.org/10.5194/gmd-17-8817-2024</w:t>
       </w:r>
     </w:p>
     <w:p>
@@ -8089,15 +7004,7 @@
           <w:color w:val="000000"/>
           <w:sz w:val="24"/>
         </w:rPr>
-        <w:t>Müller Schmied, H., Trautmann, T., Ackermann, S., Cáceres, D., Flörke, M., Gerdener, H., Kynas</w:t>
-      </w:r>
-      <w:r>
-        <w:rPr>
-          <w:rFonts w:ascii="Times New Roman" w:hAnsi="Times New Roman"/>
-          <w:color w:val="000000"/>
-          <w:sz w:val="24"/>
-        </w:rPr>
-        <w:t>t, E., Peiris, T. A., Schiebener, L., Schumacher, M., &amp; Döll, P. (2024). WaterGAP v2.2e model output driven by GSWP3–ERA5 neglecting direct human impacts [Data set]. Goethe University Frankfurt. https://doi.org/10.25716/GUDE.1TWP-GNQP</w:t>
+        <w:t>Müller Schmied, H., Trautmann, T., Ackermann, S., Cáceres, D., Flörke, M., Gerdener, H., Kynast, E., Peiris, T. A., Schiebener, L., Schumacher, M., &amp; Döll, P. (2024). WaterGAP v2.2e model output driven by GSWP3–ERA5 neglecting direct human impacts [Data set]. Goethe University Frankfurt. https://doi.org/10.25716/GUDE.1TWP-GNQP</w:t>
       </w:r>
     </w:p>
     <w:p>
@@ -8111,23 +7018,7 @@
           <w:color w:val="000000"/>
           <w:sz w:val="24"/>
         </w:rPr>
-        <w:t>Müller Schmied, H., T</w:t>
-      </w:r>
-      <w:r>
-        <w:rPr>
-          <w:rFonts w:ascii="Times New Roman" w:hAnsi="Times New Roman"/>
-          <w:color w:val="000000"/>
-          <w:sz w:val="24"/>
-        </w:rPr>
-        <w:t>rautmann, T., Ackermann, S., Cáceres, D., Flörke, M., Gerdener, H., Kynast, E., Peiris, T. A., Schiebener, L., Schumacher, M., &amp; Döll, P. (2024). WaterGAP v2.2e model output driven by GSWP3–ERA5 with historical direct human impacts [Data set]. Goethe Unive</w:t>
-      </w:r>
-      <w:r>
-        <w:rPr>
-          <w:rFonts w:ascii="Times New Roman" w:hAnsi="Times New Roman"/>
-          <w:color w:val="000000"/>
-          <w:sz w:val="24"/>
-        </w:rPr>
-        <w:t>rsity Frankfurt. https://doi.org/10.25716/GUDE.14B4-KQ6R</w:t>
+        <w:t>Müller Schmied, H., Trautmann, T., Ackermann, S., Cáceres, D., Flörke, M., Gerdener, H., Kynast, E., Peiris, T. A., Schiebener, L., Schumacher, M., &amp; Döll, P. (2024). WaterGAP v2.2e model output driven by GSWP3–ERA5 with historical direct human impacts [Data set]. Goethe University Frankfurt. https://doi.org/10.25716/GUDE.14B4-KQ6R</w:t>
       </w:r>
     </w:p>
     <w:p>
@@ -8156,15 +7047,7 @@
           <w:sz w:val="24"/>
         </w:rPr>
         <w:lastRenderedPageBreak/>
-        <w:t>Office of the National Water Resources. (n.d.). Thailand principal-basin boundaries</w:t>
-      </w:r>
-      <w:r>
-        <w:rPr>
-          <w:rFonts w:ascii="Times New Roman" w:hAnsi="Times New Roman"/>
-          <w:color w:val="000000"/>
-          <w:sz w:val="24"/>
-        </w:rPr>
-        <w:t xml:space="preserve"> [Project-supplied shapefile MainBasin_ONWR_Law_WGS84].</w:t>
+        <w:t>Office of the National Water Resources. (n.d.). Thailand principal-basin boundaries [Project-supplied shapefile MainBasin_ONWR_Law_WGS84].</w:t>
       </w:r>
     </w:p>
     <w:p>
@@ -8178,15 +7061,7 @@
           <w:color w:val="000000"/>
           <w:sz w:val="24"/>
         </w:rPr>
-        <w:t>Rodell, M., Houser, P. R., Jambor, U., Gottschalck, J., Mitchell, K., Meng, C.-J., Arsenault, K., Cosgrove, B., Radakovich, J., Bosilovich, M., Entin, J. K., Walker, J. P., Lohmann, D., &amp; Toll, D. (20</w:t>
-      </w:r>
-      <w:r>
-        <w:rPr>
-          <w:rFonts w:ascii="Times New Roman" w:hAnsi="Times New Roman"/>
-          <w:color w:val="000000"/>
-          <w:sz w:val="24"/>
-        </w:rPr>
-        <w:t>04). The global land data assimilation system. Bulletin of the American Meteorological Society, 85(3), 381–394. https://doi.org/10.1175/BAMS-85-3-381</w:t>
+        <w:t>Rodell, M., Houser, P. R., Jambor, U., Gottschalck, J., Mitchell, K., Meng, C.-J., Arsenault, K., Cosgrove, B., Radakovich, J., Bosilovich, M., Entin, J. K., Walker, J. P., Lohmann, D., &amp; Toll, D. (2004). The global land data assimilation system. Bulletin of the American Meteorological Society, 85(3), 381–394. https://doi.org/10.1175/BAMS-85-3-381</w:t>
       </w:r>
     </w:p>
     <w:p>
@@ -8203,7 +7078,7 @@
         </w:numPr>
         <w:spacing w:after="480"/>
       </w:pPr>
-      <w:bookmarkStart w:id="44" w:name="_Toc243747328"/>
+      <w:bookmarkStart w:id="44" w:name="_Toc243756256"/>
       <w:r>
         <w:rPr>
           <w:color w:val="000000"/>
@@ -12387,7 +11262,7 @@
         </w:numPr>
         <w:spacing w:after="480"/>
       </w:pPr>
-      <w:bookmarkStart w:id="47" w:name="_Toc243747329"/>
+      <w:bookmarkStart w:id="47" w:name="_Toc243756257"/>
       <w:r>
         <w:rPr>
           <w:color w:val="000000"/>
@@ -12415,23 +11290,7 @@
           <w:color w:val="000000"/>
           <w:sz w:val="24"/>
         </w:rPr>
-        <w:t xml:space="preserve">Authoritative revised outputs are in </w:t>
-      </w:r>
-      <w:r>
-        <w:rPr>
-          <w:rFonts w:ascii="Times New Roman" w:hAnsi="Times New Roman"/>
-          <w:color w:val="000000"/>
-          <w:sz w:val="24"/>
-        </w:rPr>
-        <w:t>Thailand_Objective2/analysis_v4. Objective 1 remains in Thailand_Objective1/analysis_v3. Scripts 06 to 10 implement the naturalized decomposition, emulators, groundwater checks, release figures and application export. Earlier GRACE-trained experiments rema</w:t>
-      </w:r>
-      <w:r>
-        <w:rPr>
-          <w:rFonts w:ascii="Times New Roman" w:hAnsi="Times New Roman"/>
-          <w:color w:val="000000"/>
-          <w:sz w:val="24"/>
-        </w:rPr>
-        <w:t>in in analysis_v3 and must not be relabelled naturalized training. The source inventory and subset provenance are retained under shared_data/WaterGAP.</w:t>
+        <w:t>Authoritative revised outputs are in Thailand_Objective2/analysis_v4. Objective 1 remains in Thailand_Objective1/analysis_v3. Scripts 06 to 10 implement the naturalized decomposition, emulators, groundwater checks, release figures and application export. Earlier GRACE-trained experiments remain in analysis_v3 and must not be relabelled naturalized training. The source inventory and subset provenance are retained under shared_data/WaterGAP.</w:t>
       </w:r>
     </w:p>
     <w:p>
@@ -12445,23 +11304,7 @@
           <w:color w:val="000000"/>
           <w:sz w:val="24"/>
         </w:rPr>
-        <w:t>The supplied GRACE file identifies only units centimetres, CRS EPSG 4326 and 0.25-degree resolution. Proc</w:t>
-      </w:r>
-      <w:r>
-        <w:rPr>
-          <w:rFonts w:ascii="Times New Roman" w:hAnsi="Times New Roman"/>
-          <w:color w:val="000000"/>
-          <w:sz w:val="24"/>
-        </w:rPr>
-        <w:t xml:space="preserve">essing centre, product release and leakage corrections cannot be established from that file. The published G3P groundwater product is a related sensitivity, not an independent observation. GROW derivatives retain package CC BY-NC-SA 4.0 terms; WaterGAP is </w:t>
-      </w:r>
-      <w:r>
-        <w:rPr>
-          <w:rFonts w:ascii="Times New Roman" w:hAnsi="Times New Roman"/>
-          <w:color w:val="000000"/>
-          <w:sz w:val="24"/>
-        </w:rPr>
-        <w:t>CC BY 4.0. Source-specific provenance and licensing must accompany redistribution.</w:t>
+        <w:t>The supplied GRACE file identifies only units centimetres, CRS EPSG 4326 and 0.25-degree resolution. Processing centre, product release and leakage corrections cannot be established from that file. The published G3P groundwater product is a related sensitivity, not an independent observation. GROW derivatives retain package CC BY-NC-SA 4.0 terms; WaterGAP is CC BY 4.0. Source-specific provenance and licensing must accompany redistribution.</w:t>
       </w:r>
     </w:p>
     <w:p>
@@ -12475,15 +11318,7 @@
           <w:color w:val="000000"/>
           <w:sz w:val="24"/>
         </w:rPr>
-        <w:t>Scientific QA verifies R = H + E and O = C + R on the common footprint, additive OLS point slopes, 46 emulator ensembles and actual well observation counts. Missing GRACE mo</w:t>
-      </w:r>
-      <w:r>
-        <w:rPr>
-          <w:rFonts w:ascii="Times New Roman" w:hAnsi="Times New Roman"/>
-          <w:color w:val="000000"/>
-          <w:sz w:val="24"/>
-        </w:rPr>
-        <w:t>nths and post-2023 counterfactuals remain absent. The website and manuscript do not provide measured pumping volumes or a direct human TWSA validation by wells.</w:t>
+        <w:t>Scientific QA verifies R = H + E and O = C + R on the common footprint, additive OLS point slopes, 46 emulator ensembles and actual well observation counts. Missing GRACE months and post-2023 counterfactuals remain absent. The website and manuscript do not provide measured pumping volumes or a direct human TWSA validation by wells.</w:t>
       </w:r>
     </w:p>
     <w:sectPr>
@@ -13369,7 +12204,7 @@
     <w:lsdException w:name="HTML Definition" w:semiHidden="1" w:unhideWhenUsed="1"/>
     <w:lsdException w:name="HTML Keyboard" w:semiHidden="1" w:unhideWhenUsed="1"/>
     <w:lsdException w:name="HTML Variable" w:semiHidden="1" w:unhideWhenUsed="1"/>
-    <w:lsdException w:name="Normal Table" w:uiPriority="99"/>
+    <w:lsdException w:name="Normal Table" w:semiHidden="1" w:uiPriority="99" w:unhideWhenUsed="1"/>
     <w:lsdException w:name="annotation subject" w:semiHidden="1" w:unhideWhenUsed="1"/>
     <w:lsdException w:name="No List" w:semiHidden="1" w:uiPriority="99" w:unhideWhenUsed="1"/>
     <w:lsdException w:name="Outline List 1" w:semiHidden="1" w:uiPriority="99" w:unhideWhenUsed="1"/>
@@ -13416,8 +12251,10 @@
     <w:lsdException w:name="Table Subtle 2" w:semiHidden="1" w:unhideWhenUsed="1"/>
     <w:lsdException w:name="Table Web 1" w:semiHidden="1" w:unhideWhenUsed="1"/>
     <w:lsdException w:name="Table Web 2" w:semiHidden="1" w:unhideWhenUsed="1"/>
+    <w:lsdException w:name="Table Web 3" w:semiHidden="1" w:unhideWhenUsed="1"/>
     <w:lsdException w:name="Balloon Text" w:semiHidden="1" w:unhideWhenUsed="1"/>
     <w:lsdException w:name="Table Grid" w:uiPriority="59" w:qFormat="1"/>
+    <w:lsdException w:name="Table Theme" w:semiHidden="1" w:unhideWhenUsed="1"/>
     <w:lsdException w:name="Placeholder Text" w:semiHidden="1" w:uiPriority="99" w:unhideWhenUsed="1"/>
     <w:lsdException w:name="No Spacing" w:semiHidden="1" w:uiPriority="99" w:unhideWhenUsed="1"/>
     <w:lsdException w:name="Light Shading" w:uiPriority="60"/>
@@ -14818,23 +13655,15 @@
 </file>
 
 <file path=customXml/item1.xml><?xml version="1.0" encoding="utf-8"?>
-<p:properties xmlns:p="http://schemas.microsoft.com/office/2006/metadata/properties" xmlns:xsi="http://www.w3.org/2001/XMLSchema-instance" xmlns:pc="http://schemas.microsoft.com/office/infopath/2007/PartnerControls">
-  <documentManagement>
-    <_activity xmlns="635c204c-dc2e-4f97-a4d1-8b2836b3df1b" xsi:nil="true"/>
-  </documentManagement>
-</p:properties>
+<?mso-contentType ?>
+<FormTemplates xmlns="http://schemas.microsoft.com/sharepoint/v3/contenttype/forms">
+  <Display>DocumentLibraryForm</Display>
+  <Edit>DocumentLibraryForm</Edit>
+  <New>DocumentLibraryForm</New>
+</FormTemplates>
 </file>
 
 <file path=customXml/item2.xml><?xml version="1.0" encoding="utf-8"?>
-<b:Sources xmlns:b="http://schemas.openxmlformats.org/officeDocument/2006/bibliography" xmlns="http://schemas.openxmlformats.org/officeDocument/2006/bibliography" SelectedStyle="\APASixthEditionOfficeOnline.xsl" StyleName="APA" Version="6">
-  <b:Source xmlns:b="http://schemas.openxmlformats.org/officeDocument/2006/bibliography" xmlns="http://schemas.openxmlformats.org/officeDocument/2006/bibliography">
-    <b:Tag>Placeholder1</b:Tag>
-    <b:RefOrder>1</b:RefOrder>
-  </b:Source>
-</b:Sources>
-</file>
-
-<file path=customXml/item3.xml><?xml version="1.0" encoding="utf-8"?>
 <ct:contentTypeSchema xmlns:ct="http://schemas.microsoft.com/office/2006/metadata/contentType" xmlns:ma="http://schemas.microsoft.com/office/2006/metadata/properties/metaAttributes" ct:_="" ma:_="" ma:contentTypeName="Document" ma:contentTypeID="0x010100608552F16AE09043985F6B03B54701DB" ma:contentTypeVersion="6" ma:contentTypeDescription="Create a new document." ma:contentTypeScope="" ma:versionID="0a6556424604558a08e301c5c08b2c1c">
   <xsd:schema xmlns:xsd="http://www.w3.org/2001/XMLSchema" xmlns:xs="http://www.w3.org/2001/XMLSchema" xmlns:p="http://schemas.microsoft.com/office/2006/metadata/properties" xmlns:ns3="635c204c-dc2e-4f97-a4d1-8b2836b3df1b" targetNamespace="http://schemas.microsoft.com/office/2006/metadata/properties" ma:root="true" ma:fieldsID="b15f98e54e5806dc5f8c495426015445" ns3:_="">
     <xsd:import namespace="635c204c-dc2e-4f97-a4d1-8b2836b3df1b"/>
@@ -14990,34 +13819,32 @@
 </ct:contentTypeSchema>
 </file>
 
+<file path=customXml/item3.xml><?xml version="1.0" encoding="utf-8"?>
+<b:Sources xmlns:b="http://schemas.openxmlformats.org/officeDocument/2006/bibliography" xmlns="http://schemas.openxmlformats.org/officeDocument/2006/bibliography" SelectedStyle="\APASixthEditionOfficeOnline.xsl" StyleName="APA" Version="6">
+  <b:Source xmlns:b="http://schemas.openxmlformats.org/officeDocument/2006/bibliography" xmlns="http://schemas.openxmlformats.org/officeDocument/2006/bibliography">
+    <b:Tag>Placeholder1</b:Tag>
+    <b:RefOrder>1</b:RefOrder>
+  </b:Source>
+</b:Sources>
+</file>
+
 <file path=customXml/item4.xml><?xml version="1.0" encoding="utf-8"?>
-<?mso-contentType ?>
-<FormTemplates xmlns="http://schemas.microsoft.com/sharepoint/v3/contenttype/forms">
-  <Display>DocumentLibraryForm</Display>
-  <Edit>DocumentLibraryForm</Edit>
-  <New>DocumentLibraryForm</New>
-</FormTemplates>
+<p:properties xmlns:p="http://schemas.microsoft.com/office/2006/metadata/properties" xmlns:xsi="http://www.w3.org/2001/XMLSchema-instance" xmlns:pc="http://schemas.microsoft.com/office/infopath/2007/PartnerControls">
+  <documentManagement>
+    <_activity xmlns="635c204c-dc2e-4f97-a4d1-8b2836b3df1b" xsi:nil="true"/>
+  </documentManagement>
+</p:properties>
 </file>
 
 <file path=customXml/itemProps1.xml><?xml version="1.0" encoding="utf-8"?>
-<ds:datastoreItem xmlns:ds="http://schemas.openxmlformats.org/officeDocument/2006/customXml" ds:itemID="{F3754F7B-0580-4006-B632-CBB17E8DB528}">
+<ds:datastoreItem xmlns:ds="http://schemas.openxmlformats.org/officeDocument/2006/customXml" ds:itemID="{4F8D12AB-6260-45D5-8081-DC95E52588EA}">
   <ds:schemaRefs>
-    <ds:schemaRef ds:uri="http://schemas.microsoft.com/office/2006/metadata/properties"/>
-    <ds:schemaRef ds:uri="http://schemas.microsoft.com/office/infopath/2007/PartnerControls"/>
-    <ds:schemaRef ds:uri="635c204c-dc2e-4f97-a4d1-8b2836b3df1b"/>
+    <ds:schemaRef ds:uri="http://schemas.microsoft.com/sharepoint/v3/contenttype/forms"/>
   </ds:schemaRefs>
 </ds:datastoreItem>
 </file>
 
 <file path=customXml/itemProps2.xml><?xml version="1.0" encoding="utf-8"?>
-<ds:datastoreItem xmlns:ds="http://schemas.openxmlformats.org/officeDocument/2006/customXml" ds:itemID="{D6DBCA10-1DB6-4F3C-AD2B-DE86D8790E94}">
-  <ds:schemaRefs>
-    <ds:schemaRef ds:uri="http://schemas.openxmlformats.org/officeDocument/2006/bibliography"/>
-  </ds:schemaRefs>
-</ds:datastoreItem>
-</file>
-
-<file path=customXml/itemProps3.xml><?xml version="1.0" encoding="utf-8"?>
 <ds:datastoreItem xmlns:ds="http://schemas.openxmlformats.org/officeDocument/2006/customXml" ds:itemID="{368C84A7-6D2C-4921-8DAB-A03D30FBD645}">
   <ds:schemaRefs>
     <ds:schemaRef ds:uri="http://schemas.microsoft.com/office/2006/metadata/contentType"/>
@@ -15035,10 +13862,20 @@
 </ds:datastoreItem>
 </file>
 
+<file path=customXml/itemProps3.xml><?xml version="1.0" encoding="utf-8"?>
+<ds:datastoreItem xmlns:ds="http://schemas.openxmlformats.org/officeDocument/2006/customXml" ds:itemID="{D6DBCA10-1DB6-4F3C-AD2B-DE86D8790E94}">
+  <ds:schemaRefs>
+    <ds:schemaRef ds:uri="http://schemas.openxmlformats.org/officeDocument/2006/bibliography"/>
+  </ds:schemaRefs>
+</ds:datastoreItem>
+</file>
+
 <file path=customXml/itemProps4.xml><?xml version="1.0" encoding="utf-8"?>
-<ds:datastoreItem xmlns:ds="http://schemas.openxmlformats.org/officeDocument/2006/customXml" ds:itemID="{4F8D12AB-6260-45D5-8081-DC95E52588EA}">
+<ds:datastoreItem xmlns:ds="http://schemas.openxmlformats.org/officeDocument/2006/customXml" ds:itemID="{F3754F7B-0580-4006-B632-CBB17E8DB528}">
   <ds:schemaRefs>
-    <ds:schemaRef ds:uri="http://schemas.microsoft.com/sharepoint/v3/contenttype/forms"/>
+    <ds:schemaRef ds:uri="http://schemas.microsoft.com/office/2006/metadata/properties"/>
+    <ds:schemaRef ds:uri="http://schemas.microsoft.com/office/infopath/2007/PartnerControls"/>
+    <ds:schemaRef ds:uri="635c204c-dc2e-4f97-a4d1-8b2836b3df1b"/>
   </ds:schemaRefs>
 </ds:datastoreItem>
 </file>
</xml_diff>